<commit_message>
Audit briefs revised after the pre-audit (F1 open, claims reworded, section 9), docx rebuilt, md_to_docx.py
Co-Authored-By: Claude Sonnet 5.5 <noreply@anthropic.com>
Claude-Session: https://claude.ai/code/session_011DEBbpPzzheAYqv2omaHb3
</commit_message>
<xml_diff>
--- a/unpruuf/evidence/AUDIT_BRIEF_ANDROID_APP.docx
+++ b/unpruuf/evidence/AUDIT_BRIEF_ANDROID_APP.docx
@@ -4,14 +4,13 @@
   <w:body>
     <w:p>
       <w:pPr>
-        <w:pStyle w:val="Title"/>
+        <w:pStyle w:val="Heading1"/>
       </w:pPr>
       <w:r>
         <w:t>Independent security review: Android app</w:t>
       </w:r>
     </w:p>
     <w:p>
-      <w:r/>
       <w:r>
         <w:rPr>
           <w:b/>
@@ -24,11 +23,10 @@
     </w:p>
     <w:p>
       <w:r>
-        <w:t>NexonAI Consulting SRL, Alba Iulia, Romania. Draft of 19 October 2026.</w:t>
+        <w:t>NexonAI Consulting SRL, Alba Iulia, Romania. Draft of 19 October 2026, revised on 25 October 2026 after our own pre-audit (section 9).</w:t>
       </w:r>
     </w:p>
     <w:p>
-      <w:r/>
       <w:r>
         <w:rPr>
           <w:b/>
@@ -41,7 +39,7 @@
     </w:p>
     <w:p>
       <w:pPr>
-        <w:pStyle w:val="Heading1"/>
+        <w:pStyle w:val="Heading2"/>
       </w:pPr>
       <w:r>
         <w:t>1. What we want to be able to say afterwards</w:t>
@@ -68,7 +66,7 @@
         <w:pStyle w:val="ListNumber"/>
       </w:pPr>
       <w:r>
-        <w:t>A message is written to the sender's own node and read from the contact's nodes, and nobody who runs a node can read it, name its sender or tell a real message from cover traffic.</w:t>
+        <w:t>A message is written to the sender's own node and read from the contact's nodes, and nobody who runs a node can read it, name its sender or tell a real message from cover traffic (the last point holds only after the wire-format decision F1 is carried out, see section 3).</w:t>
       </w:r>
     </w:p>
     <w:p>
@@ -84,7 +82,7 @@
         <w:pStyle w:val="ListNumber"/>
       </w:pPr>
       <w:r>
-        <w:t>Keys and secrets on the phone are protected by the phone's key store. The panic PIN removes what we say it removes.</w:t>
+        <w:t>Keys and secrets on the phone are protected by the phone's key store, including, since 25 October 2026, the key of the contact database (not yet tested on a device). The panic PIN removes what we say it removes.</w:t>
       </w:r>
     </w:p>
     <w:p>
@@ -110,7 +108,7 @@
     </w:p>
     <w:p>
       <w:pPr>
-        <w:pStyle w:val="Heading1"/>
+        <w:pStyle w:val="Heading2"/>
       </w:pPr>
       <w:r>
         <w:t>2. The app in one page</w:t>
@@ -134,6 +132,7 @@
       <w:r>
         <w:rPr>
           <w:rFonts w:ascii="Consolas" w:hAnsi="Consolas"/>
+          <w:sz w:val="18"/>
         </w:rPr>
         <w:t>standard</w:t>
       </w:r>
@@ -143,6 +142,7 @@
       <w:r>
         <w:rPr>
           <w:rFonts w:ascii="Consolas" w:hAnsi="Consolas"/>
+          <w:sz w:val="18"/>
         </w:rPr>
         <w:t>pro</w:t>
       </w:r>
@@ -152,6 +152,7 @@
       <w:r>
         <w:rPr>
           <w:rFonts w:ascii="Consolas" w:hAnsi="Consolas"/>
+          <w:sz w:val="18"/>
         </w:rPr>
         <w:t>client</w:t>
       </w:r>
@@ -161,6 +162,7 @@
       <w:r>
         <w:rPr>
           <w:rFonts w:ascii="Consolas" w:hAnsi="Consolas"/>
+          <w:sz w:val="18"/>
         </w:rPr>
         <w:t>group</w:t>
       </w:r>
@@ -170,6 +172,7 @@
       <w:r>
         <w:rPr>
           <w:rFonts w:ascii="Consolas" w:hAnsi="Consolas"/>
+          <w:sz w:val="18"/>
         </w:rPr>
         <w:t>whistleblower</w:t>
       </w:r>
@@ -179,6 +182,7 @@
       <w:r>
         <w:rPr>
           <w:rFonts w:ascii="Consolas" w:hAnsi="Consolas"/>
+          <w:sz w:val="18"/>
         </w:rPr>
         <w:t>press</w:t>
       </w:r>
@@ -197,6 +201,7 @@
       <w:r>
         <w:rPr>
           <w:rFonts w:ascii="Consolas" w:hAnsi="Consolas"/>
+          <w:sz w:val="18"/>
         </w:rPr>
         <w:t>whistleblower</w:t>
       </w:r>
@@ -206,6 +211,7 @@
       <w:r>
         <w:rPr>
           <w:rFonts w:ascii="Consolas" w:hAnsi="Consolas"/>
+          <w:sz w:val="18"/>
         </w:rPr>
         <w:t>press</w:t>
       </w:r>
@@ -242,7 +248,7 @@
         <w:pStyle w:val="ListBullet"/>
       </w:pPr>
       <w:r>
-        <w:t>Messages live in memory only and are removed after 5 minutes or when the app locks. Contacts and node settings are stored; the secrets among them are encrypted with the phone-bound key.</w:t>
+        <w:t>Messages live in memory only and are removed after 5 minutes or when the app locks. Contacts and node settings are stored; the secrets among them, and the key of the contact database, are encrypted with the phone-bound key. Older installs are migrated once at the first start (database re-keyed, file copy kept until the check succeeds).</w:t>
       </w:r>
     </w:p>
     <w:p>
@@ -263,7 +269,7 @@
     </w:p>
     <w:p>
       <w:pPr>
-        <w:pStyle w:val="Heading1"/>
+        <w:pStyle w:val="Heading2"/>
       </w:pPr>
       <w:r>
         <w:t>3. Preconditions NexonAI completes before kick-off</w:t>
@@ -282,7 +288,16 @@
         <w:pStyle w:val="ListBullet"/>
       </w:pPr>
       <w:r>
-        <w:t>Wire format v2: the message length and a version byte inside the encrypted part, every stored packet uniform 4096 bytes, cover packets random bytes. Test vectors for the format.</w:t>
+        <w:t xml:space="preserve">Wire format v2: the message length and a version byte inside the encrypted part, every stored packet uniform 4096 bytes, cover packets random bytes. Test vectors for the format. </w:t>
+      </w:r>
+      <w:r>
+        <w:rPr>
+          <w:b/>
+        </w:rPr>
+        <w:t>Status on 25 October 2026: not done.</w:t>
+      </w:r>
+      <w:r>
+        <w:t xml:space="preserve"> The payload length is still readable in each stored packet (our finding F1, decision pending; the padding is zeros behind the message, L12). The audit should start after this is closed.</w:t>
       </w:r>
     </w:p>
     <w:p>
@@ -290,7 +305,7 @@
         <w:pStyle w:val="ListBullet"/>
       </w:pPr>
       <w:r>
-        <w:t>The evidence package re-run on the tag. Unit tests for the app run green on the tag.</w:t>
+        <w:t>The evidence package re-run on the tag. Unit tests for the app run green on the tag (196 tests per build on 25 October 2026).</w:t>
       </w:r>
     </w:p>
     <w:p>
@@ -303,7 +318,7 @@
     </w:p>
     <w:p>
       <w:pPr>
-        <w:pStyle w:val="Heading1"/>
+        <w:pStyle w:val="Heading2"/>
       </w:pPr>
       <w:r>
         <w:t>4. Claims to test</w:t>
@@ -316,6 +331,7 @@
       <w:r>
         <w:rPr>
           <w:rFonts w:ascii="Consolas" w:hAnsi="Consolas"/>
+          <w:sz w:val="18"/>
         </w:rPr>
         <w:t>evidence/CLAIMS_TO_EVIDENCE.md</w:t>
       </w:r>
@@ -339,11 +355,19 @@
         <w:tc>
           <w:tcPr>
             <w:tcW w:type="dxa" w:w="2160"/>
+            <w:shd w:val="clear" w:color="auto" w:fill="E7ECEF"/>
           </w:tcPr>
           <w:p>
             <w:r>
               <w:rPr>
                 <w:b/>
+                <w:sz w:val="17"/>
+              </w:rPr>
+            </w:r>
+            <w:r>
+              <w:rPr>
+                <w:b/>
+                <w:sz w:val="17"/>
               </w:rPr>
               <w:t>#</w:t>
             </w:r>
@@ -352,11 +376,19 @@
         <w:tc>
           <w:tcPr>
             <w:tcW w:type="dxa" w:w="2160"/>
+            <w:shd w:val="clear" w:color="auto" w:fill="E7ECEF"/>
           </w:tcPr>
           <w:p>
             <w:r>
               <w:rPr>
                 <w:b/>
+                <w:sz w:val="17"/>
+              </w:rPr>
+            </w:r>
+            <w:r>
+              <w:rPr>
+                <w:b/>
+                <w:sz w:val="17"/>
               </w:rPr>
               <w:t>Claim</w:t>
             </w:r>
@@ -365,11 +397,19 @@
         <w:tc>
           <w:tcPr>
             <w:tcW w:type="dxa" w:w="2160"/>
+            <w:shd w:val="clear" w:color="auto" w:fill="E7ECEF"/>
           </w:tcPr>
           <w:p>
             <w:r>
               <w:rPr>
                 <w:b/>
+                <w:sz w:val="17"/>
+              </w:rPr>
+            </w:r>
+            <w:r>
+              <w:rPr>
+                <w:b/>
+                <w:sz w:val="17"/>
               </w:rPr>
               <w:t>What we ask the auditor to do</w:t>
             </w:r>
@@ -378,11 +418,19 @@
         <w:tc>
           <w:tcPr>
             <w:tcW w:type="dxa" w:w="2160"/>
+            <w:shd w:val="clear" w:color="auto" w:fill="E7ECEF"/>
           </w:tcPr>
           <w:p>
             <w:r>
               <w:rPr>
                 <w:b/>
+                <w:sz w:val="17"/>
+              </w:rPr>
+            </w:r>
+            <w:r>
+              <w:rPr>
+                <w:b/>
+                <w:sz w:val="17"/>
               </w:rPr>
               <w:t>Our evidence now</w:t>
             </w:r>
@@ -396,6 +444,14 @@
           </w:tcPr>
           <w:p>
             <w:r>
+              <w:rPr>
+                <w:sz w:val="17"/>
+              </w:rPr>
+            </w:r>
+            <w:r>
+              <w:rPr>
+                <w:sz w:val="17"/>
+              </w:rPr>
               <w:t>A1</w:t>
             </w:r>
           </w:p>
@@ -406,7 +462,15 @@
           </w:tcPr>
           <w:p>
             <w:r>
-              <w:t>No identities. The pairing code has no user id and the contact record has no phone, e-mail or account. No analytics, advertising or Google services library. Nine permissions, none for contacts, location, phone, SMS, microphone, accounts, calendar or storage.</w:t>
+              <w:rPr>
+                <w:sz w:val="17"/>
+              </w:rPr>
+            </w:r>
+            <w:r>
+              <w:rPr>
+                <w:sz w:val="17"/>
+              </w:rPr>
+              <w:t>No identities. The pairing code has no user id and the contact record has no phone, e-mail or account. No analytics, advertising or Google services library. Eleven permissions in the merged manifest (nine of ours and two, USE_BIOMETRIC and USE_FINGERPRINT, from the biometric library), none for contacts, location, phone, SMS, microphone, accounts, calendar or storage.</w:t>
             </w:r>
           </w:p>
         </w:tc>
@@ -416,6 +480,14 @@
           </w:tcPr>
           <w:p>
             <w:r>
+              <w:rPr>
+                <w:sz w:val="17"/>
+              </w:rPr>
+            </w:r>
+            <w:r>
+              <w:rPr>
+                <w:sz w:val="17"/>
+              </w:rPr>
               <w:t>Review manifest, dependencies and the code that builds and reads pairing codes. Confirm on the release APK.</w:t>
             </w:r>
           </w:p>
@@ -426,65 +498,35 @@
           </w:tcPr>
           <w:p>
             <w:r>
+              <w:rPr>
+                <w:sz w:val="17"/>
+              </w:rPr>
+            </w:r>
+            <w:r>
+              <w:rPr>
+                <w:sz w:val="17"/>
+              </w:rPr>
               <w:t xml:space="preserve">B1 to B8, B11; scripts </w:t>
             </w:r>
             <w:r>
               <w:rPr>
                 <w:rFonts w:ascii="Consolas" w:hAnsi="Consolas"/>
+                <w:sz w:val="17"/>
               </w:rPr>
               <w:t>04</w:t>
             </w:r>
             <w:r>
+              <w:rPr>
+                <w:sz w:val="17"/>
+              </w:rPr>
               <w:t xml:space="preserve">, </w:t>
             </w:r>
             <w:r>
               <w:rPr>
                 <w:rFonts w:ascii="Consolas" w:hAnsi="Consolas"/>
+                <w:sz w:val="17"/>
               </w:rPr>
               <w:t>06</w:t>
-            </w:r>
-            <w:r/>
-          </w:p>
-        </w:tc>
-      </w:tr>
-      <w:tr>
-        <w:tc>
-          <w:tcPr>
-            <w:tcW w:type="dxa" w:w="2160"/>
-          </w:tcPr>
-          <w:p>
-            <w:r>
-              <w:t>A2</w:t>
-            </w:r>
-          </w:p>
-        </w:tc>
-        <w:tc>
-          <w:tcPr>
-            <w:tcW w:type="dxa" w:w="2160"/>
-          </w:tcPr>
-          <w:p>
-            <w:r>
-              <w:t>Network traffic goes through Tor only. A same-Wi-Fi shortcut exists only for direct contacts, never for Business or whistleblower.</w:t>
-            </w:r>
-          </w:p>
-        </w:tc>
-        <w:tc>
-          <w:tcPr>
-            <w:tcW w:type="dxa" w:w="2160"/>
-          </w:tcPr>
-          <w:p>
-            <w:r>
-              <w:t>Capture the traffic of a phone for several hours with Business contacts. Test a network that blocks Tor (bridges, Snowflake) and name every third party contacted on those paths.</w:t>
-            </w:r>
-          </w:p>
-        </w:tc>
-        <w:tc>
-          <w:tcPr>
-            <w:tcW w:type="dxa" w:w="2160"/>
-          </w:tcPr>
-          <w:p>
-            <w:r>
-              <w:t>B7, B9 (code only; no capture yet)</w:t>
             </w:r>
           </w:p>
         </w:tc>
@@ -496,6 +538,88 @@
           </w:tcPr>
           <w:p>
             <w:r>
+              <w:rPr>
+                <w:sz w:val="17"/>
+              </w:rPr>
+            </w:r>
+            <w:r>
+              <w:rPr>
+                <w:sz w:val="17"/>
+              </w:rPr>
+              <w:t>A2</w:t>
+            </w:r>
+          </w:p>
+        </w:tc>
+        <w:tc>
+          <w:tcPr>
+            <w:tcW w:type="dxa" w:w="2160"/>
+          </w:tcPr>
+          <w:p>
+            <w:r>
+              <w:rPr>
+                <w:sz w:val="17"/>
+              </w:rPr>
+            </w:r>
+            <w:r>
+              <w:rPr>
+                <w:sz w:val="17"/>
+              </w:rPr>
+              <w:t>Network traffic goes through Tor only. A same-Wi-Fi shortcut exists only for direct contacts, never for Business or whistleblower.</w:t>
+            </w:r>
+          </w:p>
+        </w:tc>
+        <w:tc>
+          <w:tcPr>
+            <w:tcW w:type="dxa" w:w="2160"/>
+          </w:tcPr>
+          <w:p>
+            <w:r>
+              <w:rPr>
+                <w:sz w:val="17"/>
+              </w:rPr>
+            </w:r>
+            <w:r>
+              <w:rPr>
+                <w:sz w:val="17"/>
+              </w:rPr>
+              <w:t>Capture the traffic of a phone for several hours with Business contacts. Test a network that blocks Tor (bridges, Snowflake) and name every third party contacted on those paths.</w:t>
+            </w:r>
+          </w:p>
+        </w:tc>
+        <w:tc>
+          <w:tcPr>
+            <w:tcW w:type="dxa" w:w="2160"/>
+          </w:tcPr>
+          <w:p>
+            <w:r>
+              <w:rPr>
+                <w:sz w:val="17"/>
+              </w:rPr>
+            </w:r>
+            <w:r>
+              <w:rPr>
+                <w:sz w:val="17"/>
+              </w:rPr>
+              <w:t>B7, B9 (code only; no capture yet). Since 25 Oct the app accepts only v3 onion addresses (pairing codes, node lists, owner strings, migration signals) and the transport refuses any other host; unit-tested</w:t>
+            </w:r>
+          </w:p>
+        </w:tc>
+      </w:tr>
+      <w:tr>
+        <w:tc>
+          <w:tcPr>
+            <w:tcW w:type="dxa" w:w="2160"/>
+          </w:tcPr>
+          <w:p>
+            <w:r>
+              <w:rPr>
+                <w:sz w:val="17"/>
+              </w:rPr>
+            </w:r>
+            <w:r>
+              <w:rPr>
+                <w:sz w:val="17"/>
+              </w:rPr>
               <w:t>A3</w:t>
             </w:r>
           </w:p>
@@ -506,6 +630,14 @@
           </w:tcPr>
           <w:p>
             <w:r>
+              <w:rPr>
+                <w:sz w:val="17"/>
+              </w:rPr>
+            </w:r>
+            <w:r>
+              <w:rPr>
+                <w:sz w:val="17"/>
+              </w:rPr>
               <w:t>Routing tags are computable only by the two partners, change every hour and cannot be linked across contacts. Writing needs the owner secret, reading needs the tag.</w:t>
             </w:r>
           </w:p>
@@ -516,7 +648,15 @@
           </w:tcPr>
           <w:p>
             <w:r>
-              <w:t>Review the tag construction and window, the per-contact keys and node choice. Run the real flow on two phones and a server.</w:t>
+              <w:rPr>
+                <w:sz w:val="17"/>
+              </w:rPr>
+            </w:r>
+            <w:r>
+              <w:rPr>
+                <w:sz w:val="17"/>
+              </w:rPr>
+              <w:t>Review the tag construction and window, the per-contact keys and node choice. Run the real flow on two phones and a server. Note: towards a node operator the 26-hour window lets the tags of one contact be chained over days (pre-audit M4, open, tied to F1).</w:t>
             </w:r>
           </w:p>
         </w:tc>
@@ -526,15 +666,27 @@
           </w:tcPr>
           <w:p>
             <w:r>
+              <w:rPr>
+                <w:sz w:val="17"/>
+              </w:rPr>
+            </w:r>
+            <w:r>
+              <w:rPr>
+                <w:sz w:val="17"/>
+              </w:rPr>
               <w:t xml:space="preserve">B2, B3; script </w:t>
             </w:r>
             <w:r>
               <w:rPr>
                 <w:rFonts w:ascii="Consolas" w:hAnsi="Consolas"/>
+                <w:sz w:val="17"/>
               </w:rPr>
               <w:t>05</w:t>
             </w:r>
             <w:r>
+              <w:rPr>
+                <w:sz w:val="17"/>
+              </w:rPr>
               <w:t>; no third-party run</w:t>
             </w:r>
           </w:p>
@@ -547,6 +699,14 @@
           </w:tcPr>
           <w:p>
             <w:r>
+              <w:rPr>
+                <w:sz w:val="17"/>
+              </w:rPr>
+            </w:r>
+            <w:r>
+              <w:rPr>
+                <w:sz w:val="17"/>
+              </w:rPr>
               <w:t>A4</w:t>
             </w:r>
           </w:p>
@@ -557,6 +717,14 @@
           </w:tcPr>
           <w:p>
             <w:r>
+              <w:rPr>
+                <w:sz w:val="17"/>
+              </w:rPr>
+            </w:r>
+            <w:r>
+              <w:rPr>
+                <w:sz w:val="17"/>
+              </w:rPr>
               <w:t>Messages are never on disk.</w:t>
             </w:r>
           </w:p>
@@ -567,6 +735,14 @@
           </w:tcPr>
           <w:p>
             <w:r>
+              <w:rPr>
+                <w:sz w:val="17"/>
+              </w:rPr>
+            </w:r>
+            <w:r>
+              <w:rPr>
+                <w:sz w:val="17"/>
+              </w:rPr>
               <w:t>Take a forensic image of a phone after use, with and without root. Search the image for message text. Review the memory handling and its limits (strings made for the screen cannot be overwritten).</w:t>
             </w:r>
           </w:p>
@@ -577,6 +753,14 @@
           </w:tcPr>
           <w:p>
             <w:r>
+              <w:rPr>
+                <w:sz w:val="17"/>
+              </w:rPr>
+            </w:r>
+            <w:r>
+              <w:rPr>
+                <w:sz w:val="17"/>
+              </w:rPr>
               <w:t>D1 (read only)</w:t>
             </w:r>
           </w:p>
@@ -589,6 +773,14 @@
           </w:tcPr>
           <w:p>
             <w:r>
+              <w:rPr>
+                <w:sz w:val="17"/>
+              </w:rPr>
+            </w:r>
+            <w:r>
+              <w:rPr>
+                <w:sz w:val="17"/>
+              </w:rPr>
               <w:t>A5</w:t>
             </w:r>
           </w:p>
@@ -599,7 +791,15 @@
           </w:tcPr>
           <w:p>
             <w:r>
-              <w:t>Secrets are protected at rest: ratchet and onion keys, owner secrets of own nodes, node lists, feed keys, relay token. The database is encrypted.</w:t>
+              <w:rPr>
+                <w:sz w:val="17"/>
+              </w:rPr>
+            </w:r>
+            <w:r>
+              <w:rPr>
+                <w:sz w:val="17"/>
+              </w:rPr>
+              <w:t>Secrets are protected at rest: ratchet and onion keys, owner secrets of own nodes, node lists, feed keys, relay token. The database is encrypted, and its key is sealed under the phone-bound key (since 25 October 2026; before that it lay in clear next to the database, pre-audit H1).</w:t>
             </w:r>
           </w:p>
         </w:tc>
@@ -609,43 +809,93 @@
           </w:tcPr>
           <w:p>
             <w:r>
+              <w:rPr>
+                <w:sz w:val="17"/>
+              </w:rPr>
+            </w:r>
+            <w:r>
+              <w:rPr>
+                <w:sz w:val="17"/>
+              </w:rPr>
               <w:t>Review the key store use (</w:t>
             </w:r>
             <w:r>
               <w:rPr>
                 <w:rFonts w:ascii="Consolas" w:hAnsi="Consolas"/>
+                <w:sz w:val="17"/>
               </w:rPr>
               <w:t>CryptoManager</w:t>
             </w:r>
             <w:r>
+              <w:rPr>
+                <w:sz w:val="17"/>
+              </w:rPr>
               <w:t xml:space="preserve">, </w:t>
             </w:r>
             <w:r>
               <w:rPr>
                 <w:rFonts w:ascii="Consolas" w:hAnsi="Consolas"/>
+                <w:sz w:val="17"/>
               </w:rPr>
               <w:t>SealedStrings</w:t>
             </w:r>
             <w:r>
+              <w:rPr>
+                <w:sz w:val="17"/>
+              </w:rPr>
               <w:t xml:space="preserve">, </w:t>
             </w:r>
             <w:r>
               <w:rPr>
                 <w:rFonts w:ascii="Consolas" w:hAnsi="Consolas"/>
+                <w:sz w:val="17"/>
               </w:rPr>
-              <w:t>IdentityManager</w:t>
+              <w:t>DbKeyVault</w:t>
             </w:r>
             <w:r>
+              <w:rPr>
+                <w:sz w:val="17"/>
+              </w:rPr>
               <w:t xml:space="preserve">, </w:t>
             </w:r>
             <w:r>
               <w:rPr>
                 <w:rFonts w:ascii="Consolas" w:hAnsi="Consolas"/>
+                <w:sz w:val="17"/>
+              </w:rPr>
+              <w:t>IdentityManager</w:t>
+            </w:r>
+            <w:r>
+              <w:rPr>
+                <w:sz w:val="17"/>
+              </w:rPr>
+              <w:t xml:space="preserve">, </w:t>
+            </w:r>
+            <w:r>
+              <w:rPr>
+                <w:rFonts w:ascii="Consolas" w:hAnsi="Consolas"/>
+                <w:sz w:val="17"/>
               </w:rPr>
               <w:t>PinManager</w:t>
             </w:r>
             <w:r>
-              <w:t>), the SQLCipher key handling, backup settings and what remains in clear. Check upgrades from older versions.</w:t>
+              <w:rPr>
+                <w:sz w:val="17"/>
+              </w:rPr>
+              <w:t>), the SQLCipher key handling and migration, backup and device-transfer settings (</w:t>
+            </w:r>
+            <w:r>
+              <w:rPr>
+                <w:rFonts w:ascii="Consolas" w:hAnsi="Consolas"/>
+                <w:sz w:val="17"/>
+              </w:rPr>
+              <w:t>dataExtractionRules</w:t>
+            </w:r>
+            <w:r>
+              <w:rPr>
+                <w:sz w:val="17"/>
+              </w:rPr>
+              <w:t>) and what remains in clear. Check upgrades from older versions; old key material may remain in flash.</w:t>
             </w:r>
           </w:p>
         </w:tc>
@@ -655,16 +905,28 @@
           </w:tcPr>
           <w:p>
             <w:r>
+              <w:rPr>
+                <w:sz w:val="17"/>
+              </w:rPr>
+            </w:r>
+            <w:r>
+              <w:rPr>
+                <w:sz w:val="17"/>
+              </w:rPr>
               <w:t xml:space="preserve">D2, Tier 2 in </w:t>
             </w:r>
             <w:r>
               <w:rPr>
                 <w:rFonts w:ascii="Consolas" w:hAnsi="Consolas"/>
+                <w:sz w:val="17"/>
               </w:rPr>
               <w:t>SECURITY_CLAIMS.md</w:t>
             </w:r>
             <w:r>
-              <w:t>; unit tests</w:t>
+              <w:rPr>
+                <w:sz w:val="17"/>
+              </w:rPr>
+              <w:t>; 15 migration tests (logic only; SQLCipher and Keystore are not covered by unit tests); device test open</w:t>
             </w:r>
           </w:p>
         </w:tc>
@@ -676,6 +938,14 @@
           </w:tcPr>
           <w:p>
             <w:r>
+              <w:rPr>
+                <w:sz w:val="17"/>
+              </w:rPr>
+            </w:r>
+            <w:r>
+              <w:rPr>
+                <w:sz w:val="17"/>
+              </w:rPr>
               <w:t>A6</w:t>
             </w:r>
           </w:p>
@@ -686,7 +956,15 @@
           </w:tcPr>
           <w:p>
             <w:r>
-              <w:t>The panic PIN removes contacts, sessions, onion keys, groups, own nodes, node lists, feed sources, relay setup and the organisation code. The identity keys, licence and PINs stay. Wrong PINs lock the pad (5th wrong try: 30 s, doubling, at most 1 hour).</w:t>
+              <w:rPr>
+                <w:sz w:val="17"/>
+              </w:rPr>
+            </w:r>
+            <w:r>
+              <w:rPr>
+                <w:sz w:val="17"/>
+              </w:rPr>
+              <w:t>The panic PIN removes contacts, sessions, onion keys, groups, own nodes, node lists, feed sources, relay setup and the organisation code; since 25 October also the pairing code on screen, queued messages and partial transfers, and the database is cleaned (secure delete, checkpoint, vacuum). The identity keys, licence and PINs stay. Wrong PINs lock the pad (5th wrong try: 30 s, doubling, at most 1 hour; timed on the wall clock and the monotonic clock, so moving the date forward does not shorten it until the phone restarts).</w:t>
             </w:r>
           </w:p>
         </w:tc>
@@ -696,6 +974,14 @@
           </w:tcPr>
           <w:p>
             <w:r>
+              <w:rPr>
+                <w:sz w:val="17"/>
+              </w:rPr>
+            </w:r>
+            <w:r>
+              <w:rPr>
+                <w:sz w:val="17"/>
+              </w:rPr>
               <w:t>Test on devices from two makers. Check what remains. Judge a 4-digit PIN against someone with root, who can reset the counter. Judge the loss of the phone key (the app then says it cannot read the PIN).</w:t>
             </w:r>
           </w:p>
@@ -706,6 +992,14 @@
           </w:tcPr>
           <w:p>
             <w:r>
+              <w:rPr>
+                <w:sz w:val="17"/>
+              </w:rPr>
+            </w:r>
+            <w:r>
+              <w:rPr>
+                <w:sz w:val="17"/>
+              </w:rPr>
               <w:t>D3, D3a; unit tests for the schedule</w:t>
             </w:r>
           </w:p>
@@ -718,6 +1012,14 @@
           </w:tcPr>
           <w:p>
             <w:r>
+              <w:rPr>
+                <w:sz w:val="17"/>
+              </w:rPr>
+            </w:r>
+            <w:r>
+              <w:rPr>
+                <w:sz w:val="17"/>
+              </w:rPr>
               <w:t>A7</w:t>
             </w:r>
           </w:p>
@@ -728,7 +1030,15 @@
           </w:tcPr>
           <w:p>
             <w:r>
-              <w:t>Screenshot, screen recording and the app switcher show nothing, including dialogs. Notifications say only that a message arrived. Clipboard copies of codes are marked sensitive and cleared after 60 s.</w:t>
+              <w:rPr>
+                <w:sz w:val="17"/>
+              </w:rPr>
+            </w:r>
+            <w:r>
+              <w:rPr>
+                <w:sz w:val="17"/>
+              </w:rPr>
+              <w:t>Screenshot, screen recording and the app switcher show nothing, including dialogs. Notifications say only that a message arrived. Clipboard copies of codes are marked sensitive and cleared after 60 s (also when the app is in the background since 25 October; before, Android 10+ prevented the check and the code stayed).</w:t>
             </w:r>
           </w:p>
         </w:tc>
@@ -738,6 +1048,14 @@
           </w:tcPr>
           <w:p>
             <w:r>
+              <w:rPr>
+                <w:sz w:val="17"/>
+              </w:rPr>
+            </w:r>
+            <w:r>
+              <w:rPr>
+                <w:sz w:val="17"/>
+              </w:rPr>
               <w:t>Test on devices from two makers and on Android 12 and 13 or later.</w:t>
             </w:r>
           </w:p>
@@ -748,7 +1066,15 @@
           </w:tcPr>
           <w:p>
             <w:r>
-              <w:t>B10; device test open</w:t>
+              <w:rPr>
+                <w:sz w:val="17"/>
+              </w:rPr>
+            </w:r>
+            <w:r>
+              <w:rPr>
+                <w:sz w:val="17"/>
+              </w:rPr>
+              <w:t>B10; device test open for the screen blocks, the clipboard and the date change</w:t>
             </w:r>
           </w:p>
         </w:tc>
@@ -760,6 +1086,14 @@
           </w:tcPr>
           <w:p>
             <w:r>
+              <w:rPr>
+                <w:sz w:val="17"/>
+              </w:rPr>
+            </w:r>
+            <w:r>
+              <w:rPr>
+                <w:sz w:val="17"/>
+              </w:rPr>
               <w:t>A8</w:t>
             </w:r>
           </w:p>
@@ -770,7 +1104,15 @@
           </w:tcPr>
           <w:p>
             <w:r>
-              <w:t>The crypto is sound: Double Ratchet (X25519, HKDF, XChaCha20-Poly1305), a session start without signed identities (a reduced X3DH), the outer AES-256-GCM layer, wire format v2 (padding inside the authenticated part, uniform packets).</w:t>
+              <w:rPr>
+                <w:sz w:val="17"/>
+              </w:rPr>
+            </w:r>
+            <w:r>
+              <w:rPr>
+                <w:sz w:val="17"/>
+              </w:rPr>
+              <w:t>The crypto is sound: Double Ratchet (X25519, HKDF, XChaCha20-Poly1305), a session start without signed identities (a reduced X3DH), the outer AES-256-GCM layer, wire format v2 (planned, not built: padding inside the authenticated part, uniform packets; see F1).</w:t>
             </w:r>
           </w:p>
         </w:tc>
@@ -780,7 +1122,15 @@
           </w:tcPr>
           <w:p>
             <w:r>
-              <w:t>Review the protocol and the code. Decide whether the reduced session start is acceptable for the threat model. Check IV handling, key separation, error handling and replay.</w:t>
+              <w:rPr>
+                <w:sz w:val="17"/>
+              </w:rPr>
+            </w:r>
+            <w:r>
+              <w:rPr>
+                <w:sz w:val="17"/>
+              </w:rPr>
+              <w:t>Review the protocol and the code. Decide whether the reduced session start is acceptable for the threat model. Check IV handling, key separation, error handling and replay. Note: control signals (delete contact, node migration, temp node) are protected only by the static outer layer from the pairing code, not by the ratchet (pre-audit M6, open).</w:t>
             </w:r>
           </w:p>
         </w:tc>
@@ -790,6 +1140,14 @@
           </w:tcPr>
           <w:p>
             <w:r>
+              <w:rPr>
+                <w:sz w:val="17"/>
+              </w:rPr>
+            </w:r>
+            <w:r>
+              <w:rPr>
+                <w:sz w:val="17"/>
+              </w:rPr>
               <w:t>C1 to C6; cross-checks between Kotlin and TypeScript</w:t>
             </w:r>
           </w:p>
@@ -802,6 +1160,14 @@
           </w:tcPr>
           <w:p>
             <w:r>
+              <w:rPr>
+                <w:sz w:val="17"/>
+              </w:rPr>
+            </w:r>
+            <w:r>
+              <w:rPr>
+                <w:sz w:val="17"/>
+              </w:rPr>
               <w:t>A9</w:t>
             </w:r>
           </w:p>
@@ -812,6 +1178,14 @@
           </w:tcPr>
           <w:p>
             <w:r>
+              <w:rPr>
+                <w:sz w:val="17"/>
+              </w:rPr>
+            </w:r>
+            <w:r>
+              <w:rPr>
+                <w:sz w:val="17"/>
+              </w:rPr>
               <w:t>Input from outside is handled safely: pairing codes, node-list files, feed content, group codes, images, attachments, malformed packets.</w:t>
             </w:r>
           </w:p>
@@ -822,7 +1196,15 @@
           </w:tcPr>
           <w:p>
             <w:r>
-              <w:t>Fuzz these inputs. Test oversized and malformed images (a decoder guard exists since 19 October 2026). Review the node-list parser and the confirmation dialog.</w:t>
+              <w:rPr>
+                <w:sz w:val="17"/>
+              </w:rPr>
+            </w:r>
+            <w:r>
+              <w:rPr>
+                <w:sz w:val="17"/>
+              </w:rPr>
+              <w:t>Fuzz these inputs. Test oversized and malformed images (a decoder guard exists since 19 October 2026). Review the node-list parser and the confirmation dialog. Since 25 October: chunk count, packet header fields, reply head lines and node-list size are bounded.</w:t>
             </w:r>
           </w:p>
         </w:tc>
@@ -832,7 +1214,15 @@
           </w:tcPr>
           <w:p>
             <w:r>
-              <w:t>Parser limits and tests</w:t>
+              <w:rPr>
+                <w:sz w:val="17"/>
+              </w:rPr>
+            </w:r>
+            <w:r>
+              <w:rPr>
+                <w:sz w:val="17"/>
+              </w:rPr>
+              <w:t>Parser limits and tests (chunk limit, header check, list size and speed)</w:t>
             </w:r>
           </w:p>
         </w:tc>
@@ -844,6 +1234,14 @@
           </w:tcPr>
           <w:p>
             <w:r>
+              <w:rPr>
+                <w:sz w:val="17"/>
+              </w:rPr>
+            </w:r>
+            <w:r>
+              <w:rPr>
+                <w:sz w:val="17"/>
+              </w:rPr>
               <w:t>A10</w:t>
             </w:r>
           </w:p>
@@ -854,6 +1252,14 @@
           </w:tcPr>
           <w:p>
             <w:r>
+              <w:rPr>
+                <w:sz w:val="17"/>
+              </w:rPr>
+            </w:r>
+            <w:r>
+              <w:rPr>
+                <w:sz w:val="17"/>
+              </w:rPr>
               <w:t>Licence and device check run offline and send nothing. A root check and a build expiry exist in release builds.</w:t>
             </w:r>
           </w:p>
@@ -864,24 +1270,40 @@
           </w:tcPr>
           <w:p>
             <w:r>
+              <w:rPr>
+                <w:sz w:val="17"/>
+              </w:rPr>
+            </w:r>
+            <w:r>
+              <w:rPr>
+                <w:sz w:val="17"/>
+              </w:rPr>
               <w:t xml:space="preserve">Review </w:t>
             </w:r>
             <w:r>
               <w:rPr>
                 <w:rFonts w:ascii="Consolas" w:hAnsi="Consolas"/>
+                <w:sz w:val="17"/>
               </w:rPr>
               <w:t>LicenseManager</w:t>
             </w:r>
             <w:r>
+              <w:rPr>
+                <w:sz w:val="17"/>
+              </w:rPr>
               <w:t xml:space="preserve">, </w:t>
             </w:r>
             <w:r>
               <w:rPr>
                 <w:rFonts w:ascii="Consolas" w:hAnsi="Consolas"/>
+                <w:sz w:val="17"/>
               </w:rPr>
               <w:t>RootDetector</w:t>
             </w:r>
             <w:r>
+              <w:rPr>
+                <w:sz w:val="17"/>
+              </w:rPr>
               <w:t xml:space="preserve"> and the expiry gate. State how far they hold against a modified app (we call them honest friction, not protection).</w:t>
             </w:r>
           </w:p>
@@ -892,6 +1314,14 @@
           </w:tcPr>
           <w:p>
             <w:r>
+              <w:rPr>
+                <w:sz w:val="17"/>
+              </w:rPr>
+            </w:r>
+            <w:r>
+              <w:rPr>
+                <w:sz w:val="17"/>
+              </w:rPr>
               <w:t>B8, F2</w:t>
             </w:r>
           </w:p>
@@ -904,6 +1334,14 @@
           </w:tcPr>
           <w:p>
             <w:r>
+              <w:rPr>
+                <w:sz w:val="17"/>
+              </w:rPr>
+            </w:r>
+            <w:r>
+              <w:rPr>
+                <w:sz w:val="17"/>
+              </w:rPr>
               <w:t>A11</w:t>
             </w:r>
           </w:p>
@@ -914,6 +1352,14 @@
           </w:tcPr>
           <w:p>
             <w:r>
+              <w:rPr>
+                <w:sz w:val="17"/>
+              </w:rPr>
+            </w:r>
+            <w:r>
+              <w:rPr>
+                <w:sz w:val="17"/>
+              </w:rPr>
               <w:t>The delivered app equals the reviewed source.</w:t>
             </w:r>
           </w:p>
@@ -924,6 +1370,14 @@
           </w:tcPr>
           <w:p>
             <w:r>
+              <w:rPr>
+                <w:sz w:val="17"/>
+              </w:rPr>
+            </w:r>
+            <w:r>
+              <w:rPr>
+                <w:sz w:val="17"/>
+              </w:rPr>
               <w:t>Rebuild from the tag, compare the result, check the signature and the R8 mapping.</w:t>
             </w:r>
           </w:p>
@@ -934,6 +1388,14 @@
           </w:tcPr>
           <w:p>
             <w:r>
+              <w:rPr>
+                <w:sz w:val="17"/>
+              </w:rPr>
+            </w:r>
+            <w:r>
+              <w:rPr>
+                <w:sz w:val="17"/>
+              </w:rPr>
               <w:t>Release key in place; no reproducible build yet</w:t>
             </w:r>
           </w:p>
@@ -946,6 +1408,14 @@
           </w:tcPr>
           <w:p>
             <w:r>
+              <w:rPr>
+                <w:sz w:val="17"/>
+              </w:rPr>
+            </w:r>
+            <w:r>
+              <w:rPr>
+                <w:sz w:val="17"/>
+              </w:rPr>
               <w:t>A12</w:t>
             </w:r>
           </w:p>
@@ -956,6 +1426,14 @@
           </w:tcPr>
           <w:p>
             <w:r>
+              <w:rPr>
+                <w:sz w:val="17"/>
+              </w:rPr>
+            </w:r>
+            <w:r>
+              <w:rPr>
+                <w:sz w:val="17"/>
+              </w:rPr>
               <w:t>The Tor and bridge integration works as described and fails safely.</w:t>
             </w:r>
           </w:p>
@@ -966,15 +1444,27 @@
           </w:tcPr>
           <w:p>
             <w:r>
+              <w:rPr>
+                <w:sz w:val="17"/>
+              </w:rPr>
+            </w:r>
+            <w:r>
+              <w:rPr>
+                <w:sz w:val="17"/>
+              </w:rPr>
               <w:t xml:space="preserve">Review </w:t>
             </w:r>
             <w:r>
               <w:rPr>
                 <w:rFonts w:ascii="Consolas" w:hAnsi="Consolas"/>
+                <w:sz w:val="17"/>
               </w:rPr>
               <w:t>TorManager</w:t>
             </w:r>
             <w:r>
+              <w:rPr>
+                <w:sz w:val="17"/>
+              </w:rPr>
               <w:t>, the bridge manager and the pluggable transports: start, circuit use, behaviour when Tor is blocked, what leaks when it fails.</w:t>
             </w:r>
           </w:p>
@@ -985,6 +1475,14 @@
           </w:tcPr>
           <w:p>
             <w:r>
+              <w:rPr>
+                <w:sz w:val="17"/>
+              </w:rPr>
+            </w:r>
+            <w:r>
+              <w:rPr>
+                <w:sz w:val="17"/>
+              </w:rPr>
               <w:t>Not yet reviewed by us beyond B7</w:t>
             </w:r>
           </w:p>
@@ -994,7 +1492,7 @@
     <w:p/>
     <w:p>
       <w:pPr>
-        <w:pStyle w:val="Heading1"/>
+        <w:pStyle w:val="Heading2"/>
       </w:pPr>
       <w:r>
         <w:t>5. How we would like the work done</w:t>
@@ -1039,7 +1537,7 @@
     </w:p>
     <w:p>
       <w:pPr>
-        <w:pStyle w:val="Heading1"/>
+        <w:pStyle w:val="Heading2"/>
       </w:pPr>
       <w:r>
         <w:t>6. Limits we state ourselves</w:t>
@@ -1106,6 +1604,30 @@
         <w:pStyle w:val="ListBullet"/>
       </w:pPr>
       <w:r>
+        <w:t>Towards a node operator, a contact's hourly tags can be chained over days, because the app asks for the whole 26-hour window and bundles contacts per node (pre-audit M4; decided together with F1).</w:t>
+      </w:r>
+    </w:p>
+    <w:p>
+      <w:pPr>
+        <w:pStyle w:val="ListBullet"/>
+      </w:pPr>
+      <w:r>
+        <w:t>Control signals (delete contact, node migration, temp node) rely on the static outer layer, not on the ratchet (pre-audit M6).</w:t>
+      </w:r>
+    </w:p>
+    <w:p>
+      <w:pPr>
+        <w:pStyle w:val="ListBullet"/>
+      </w:pPr>
+      <w:r>
+        <w:t>Old key material of the contact database and the plain copy of older installs can remain in flash storage after the migration; the app cannot overwrite blocks the storage controller has remapped.</w:t>
+      </w:r>
+    </w:p>
+    <w:p>
+      <w:pPr>
+        <w:pStyle w:val="ListBullet"/>
+      </w:pPr>
+      <w:r>
         <w:t>Debug builds are debuggable and skip the root check. They are for tests only.</w:t>
       </w:r>
     </w:p>
@@ -1119,7 +1641,7 @@
     </w:p>
     <w:p>
       <w:pPr>
-        <w:pStyle w:val="Heading1"/>
+        <w:pStyle w:val="Heading2"/>
       </w:pPr>
       <w:r>
         <w:t>7. Out of scope</w:t>
@@ -1132,6 +1654,7 @@
       <w:r>
         <w:rPr>
           <w:rFonts w:ascii="Consolas" w:hAnsi="Consolas"/>
+          <w:sz w:val="18"/>
         </w:rPr>
         <w:t>whistleblower</w:t>
       </w:r>
@@ -1141,6 +1664,7 @@
       <w:r>
         <w:rPr>
           <w:rFonts w:ascii="Consolas" w:hAnsi="Consolas"/>
+          <w:sz w:val="18"/>
         </w:rPr>
         <w:t>press</w:t>
       </w:r>
@@ -1150,7 +1674,7 @@
     </w:p>
     <w:p>
       <w:pPr>
-        <w:pStyle w:val="Heading1"/>
+        <w:pStyle w:val="Heading2"/>
       </w:pPr>
       <w:r>
         <w:t>8. Deliverables</w:t>
@@ -1199,6 +1723,769 @@
     <w:p>
       <w:r>
         <w:t>Timing, price and contact: to be agreed.</w:t>
+      </w:r>
+    </w:p>
+    <w:p>
+      <w:pPr>
+        <w:pStyle w:val="Heading2"/>
+      </w:pPr>
+      <w:r>
+        <w:t>9. What our own pre-audit found (25 October 2026)</w:t>
+      </w:r>
+    </w:p>
+    <w:p>
+      <w:r>
+        <w:t>Before this brief went out we ran an internal adversarial review of the app and the node server (code reading, unit tests and a JVM probe; no device, no real Tor). The findings below are told here so that your time goes to what we do not already know. The detailed report is available under the confidentiality agreement.</w:t>
+      </w:r>
+    </w:p>
+    <w:tbl>
+      <w:tblPr>
+        <w:tblStyle w:val="TableGrid"/>
+        <w:tblW w:type="auto" w:w="0"/>
+        <w:tblLook w:firstColumn="1" w:firstRow="1" w:lastColumn="0" w:lastRow="0" w:noHBand="0" w:noVBand="1" w:val="04A0"/>
+      </w:tblPr>
+      <w:tblGrid>
+        <w:gridCol w:w="2880"/>
+        <w:gridCol w:w="2880"/>
+        <w:gridCol w:w="2880"/>
+      </w:tblGrid>
+      <w:tr>
+        <w:tc>
+          <w:tcPr>
+            <w:tcW w:type="dxa" w:w="2880"/>
+            <w:shd w:val="clear" w:color="auto" w:fill="E7ECEF"/>
+          </w:tcPr>
+          <w:p>
+            <w:r>
+              <w:rPr>
+                <w:b/>
+                <w:sz w:val="17"/>
+              </w:rPr>
+            </w:r>
+            <w:r>
+              <w:rPr>
+                <w:b/>
+                <w:sz w:val="17"/>
+              </w:rPr>
+              <w:t>ID</w:t>
+            </w:r>
+          </w:p>
+        </w:tc>
+        <w:tc>
+          <w:tcPr>
+            <w:tcW w:type="dxa" w:w="2880"/>
+            <w:shd w:val="clear" w:color="auto" w:fill="E7ECEF"/>
+          </w:tcPr>
+          <w:p>
+            <w:r>
+              <w:rPr>
+                <w:b/>
+                <w:sz w:val="17"/>
+              </w:rPr>
+            </w:r>
+            <w:r>
+              <w:rPr>
+                <w:b/>
+                <w:sz w:val="17"/>
+              </w:rPr>
+              <w:t>Finding</w:t>
+            </w:r>
+          </w:p>
+        </w:tc>
+        <w:tc>
+          <w:tcPr>
+            <w:tcW w:type="dxa" w:w="2880"/>
+            <w:shd w:val="clear" w:color="auto" w:fill="E7ECEF"/>
+          </w:tcPr>
+          <w:p>
+            <w:r>
+              <w:rPr>
+                <w:b/>
+                <w:sz w:val="17"/>
+              </w:rPr>
+            </w:r>
+            <w:r>
+              <w:rPr>
+                <w:b/>
+                <w:sz w:val="17"/>
+              </w:rPr>
+              <w:t>Status on 25 October 2026</w:t>
+            </w:r>
+          </w:p>
+        </w:tc>
+      </w:tr>
+      <w:tr>
+        <w:tc>
+          <w:tcPr>
+            <w:tcW w:type="dxa" w:w="2880"/>
+          </w:tcPr>
+          <w:p>
+            <w:r>
+              <w:rPr>
+                <w:sz w:val="17"/>
+              </w:rPr>
+            </w:r>
+            <w:r>
+              <w:rPr>
+                <w:sz w:val="17"/>
+              </w:rPr>
+              <w:t>F1, L12</w:t>
+            </w:r>
+          </w:p>
+        </w:tc>
+        <w:tc>
+          <w:tcPr>
+            <w:tcW w:type="dxa" w:w="2880"/>
+          </w:tcPr>
+          <w:p>
+            <w:r>
+              <w:rPr>
+                <w:sz w:val="17"/>
+              </w:rPr>
+            </w:r>
+            <w:r>
+              <w:rPr>
+                <w:sz w:val="17"/>
+              </w:rPr>
+              <w:t>Payload length readable in the stored packet; padding is zeros behind the message</w:t>
+            </w:r>
+          </w:p>
+        </w:tc>
+        <w:tc>
+          <w:tcPr>
+            <w:tcW w:type="dxa" w:w="2880"/>
+          </w:tcPr>
+          <w:p>
+            <w:r>
+              <w:rPr>
+                <w:sz w:val="17"/>
+              </w:rPr>
+            </w:r>
+            <w:r>
+              <w:rPr>
+                <w:b/>
+                <w:sz w:val="17"/>
+              </w:rPr>
+              <w:t>Open</w:t>
+            </w:r>
+            <w:r>
+              <w:rPr>
+                <w:sz w:val="17"/>
+              </w:rPr>
+              <w:t>, decision pending (wire format v2)</w:t>
+            </w:r>
+          </w:p>
+        </w:tc>
+      </w:tr>
+      <w:tr>
+        <w:tc>
+          <w:tcPr>
+            <w:tcW w:type="dxa" w:w="2880"/>
+          </w:tcPr>
+          <w:p>
+            <w:r>
+              <w:rPr>
+                <w:sz w:val="17"/>
+              </w:rPr>
+            </w:r>
+            <w:r>
+              <w:rPr>
+                <w:sz w:val="17"/>
+              </w:rPr>
+              <w:t>H1</w:t>
+            </w:r>
+          </w:p>
+        </w:tc>
+        <w:tc>
+          <w:tcPr>
+            <w:tcW w:type="dxa" w:w="2880"/>
+          </w:tcPr>
+          <w:p>
+            <w:r>
+              <w:rPr>
+                <w:sz w:val="17"/>
+              </w:rPr>
+            </w:r>
+            <w:r>
+              <w:rPr>
+                <w:sz w:val="17"/>
+              </w:rPr>
+              <w:t>Key of the contact database in clear in the app settings</w:t>
+            </w:r>
+          </w:p>
+        </w:tc>
+        <w:tc>
+          <w:tcPr>
+            <w:tcW w:type="dxa" w:w="2880"/>
+          </w:tcPr>
+          <w:p>
+            <w:r>
+              <w:rPr>
+                <w:sz w:val="17"/>
+              </w:rPr>
+            </w:r>
+            <w:r>
+              <w:rPr>
+                <w:sz w:val="17"/>
+              </w:rPr>
+              <w:t>Fixed (sealed under the phone key, migration for older installs); device test open</w:t>
+            </w:r>
+          </w:p>
+        </w:tc>
+      </w:tr>
+      <w:tr>
+        <w:tc>
+          <w:tcPr>
+            <w:tcW w:type="dxa" w:w="2880"/>
+          </w:tcPr>
+          <w:p>
+            <w:r>
+              <w:rPr>
+                <w:sz w:val="17"/>
+              </w:rPr>
+            </w:r>
+            <w:r>
+              <w:rPr>
+                <w:sz w:val="17"/>
+              </w:rPr>
+              <w:t>M9</w:t>
+            </w:r>
+          </w:p>
+        </w:tc>
+        <w:tc>
+          <w:tcPr>
+            <w:tcW w:type="dxa" w:w="2880"/>
+          </w:tcPr>
+          <w:p>
+            <w:r>
+              <w:rPr>
+                <w:sz w:val="17"/>
+              </w:rPr>
+            </w:r>
+            <w:r>
+              <w:rPr>
+                <w:sz w:val="17"/>
+              </w:rPr>
+              <w:t>Device-to-device transfer not excluded</w:t>
+            </w:r>
+          </w:p>
+        </w:tc>
+        <w:tc>
+          <w:tcPr>
+            <w:tcW w:type="dxa" w:w="2880"/>
+          </w:tcPr>
+          <w:p>
+            <w:r>
+              <w:rPr>
+                <w:sz w:val="17"/>
+              </w:rPr>
+            </w:r>
+            <w:r>
+              <w:rPr>
+                <w:sz w:val="17"/>
+              </w:rPr>
+              <w:t>Fixed (</w:t>
+            </w:r>
+            <w:r>
+              <w:rPr>
+                <w:rFonts w:ascii="Consolas" w:hAnsi="Consolas"/>
+                <w:sz w:val="17"/>
+              </w:rPr>
+              <w:t>dataExtractionRules</w:t>
+            </w:r>
+            <w:r>
+              <w:rPr>
+                <w:sz w:val="17"/>
+              </w:rPr>
+              <w:t>); device test with a maker tool open</w:t>
+            </w:r>
+          </w:p>
+        </w:tc>
+      </w:tr>
+      <w:tr>
+        <w:tc>
+          <w:tcPr>
+            <w:tcW w:type="dxa" w:w="2880"/>
+          </w:tcPr>
+          <w:p>
+            <w:r>
+              <w:rPr>
+                <w:sz w:val="17"/>
+              </w:rPr>
+            </w:r>
+            <w:r>
+              <w:rPr>
+                <w:sz w:val="17"/>
+              </w:rPr>
+              <w:t>M10</w:t>
+            </w:r>
+          </w:p>
+        </w:tc>
+        <w:tc>
+          <w:tcPr>
+            <w:tcW w:type="dxa" w:w="2880"/>
+          </w:tcPr>
+          <w:p>
+            <w:r>
+              <w:rPr>
+                <w:sz w:val="17"/>
+              </w:rPr>
+            </w:r>
+            <w:r>
+              <w:rPr>
+                <w:sz w:val="17"/>
+              </w:rPr>
+              <w:t>Panic PIN left the pairing code on screen and recoverable database rows</w:t>
+            </w:r>
+          </w:p>
+        </w:tc>
+        <w:tc>
+          <w:tcPr>
+            <w:tcW w:type="dxa" w:w="2880"/>
+          </w:tcPr>
+          <w:p>
+            <w:r>
+              <w:rPr>
+                <w:sz w:val="17"/>
+              </w:rPr>
+            </w:r>
+            <w:r>
+              <w:rPr>
+                <w:sz w:val="17"/>
+              </w:rPr>
+              <w:t>Fixed (wipe extended, secure delete, vacuum); device test open</w:t>
+            </w:r>
+          </w:p>
+        </w:tc>
+      </w:tr>
+      <w:tr>
+        <w:tc>
+          <w:tcPr>
+            <w:tcW w:type="dxa" w:w="2880"/>
+          </w:tcPr>
+          <w:p>
+            <w:r>
+              <w:rPr>
+                <w:sz w:val="17"/>
+              </w:rPr>
+            </w:r>
+            <w:r>
+              <w:rPr>
+                <w:sz w:val="17"/>
+              </w:rPr>
+              <w:t>M7</w:t>
+            </w:r>
+          </w:p>
+        </w:tc>
+        <w:tc>
+          <w:tcPr>
+            <w:tcW w:type="dxa" w:w="2880"/>
+          </w:tcPr>
+          <w:p>
+            <w:r>
+              <w:rPr>
+                <w:sz w:val="17"/>
+              </w:rPr>
+            </w:r>
+            <w:r>
+              <w:rPr>
+                <w:sz w:val="17"/>
+              </w:rPr>
+              <w:t>Node addresses not limited to v3 onions (write key could go to a plain host through an exit)</w:t>
+            </w:r>
+          </w:p>
+        </w:tc>
+        <w:tc>
+          <w:tcPr>
+            <w:tcW w:type="dxa" w:w="2880"/>
+          </w:tcPr>
+          <w:p>
+            <w:r>
+              <w:rPr>
+                <w:sz w:val="17"/>
+              </w:rPr>
+            </w:r>
+            <w:r>
+              <w:rPr>
+                <w:sz w:val="17"/>
+              </w:rPr>
+              <w:t>Fixed in pairing codes, node lists, owner strings, migration signals and the transport</w:t>
+            </w:r>
+          </w:p>
+        </w:tc>
+      </w:tr>
+      <w:tr>
+        <w:tc>
+          <w:tcPr>
+            <w:tcW w:type="dxa" w:w="2880"/>
+          </w:tcPr>
+          <w:p>
+            <w:r>
+              <w:rPr>
+                <w:sz w:val="17"/>
+              </w:rPr>
+            </w:r>
+            <w:r>
+              <w:rPr>
+                <w:sz w:val="17"/>
+              </w:rPr>
+              <w:t>L4</w:t>
+            </w:r>
+          </w:p>
+        </w:tc>
+        <w:tc>
+          <w:tcPr>
+            <w:tcW w:type="dxa" w:w="2880"/>
+          </w:tcPr>
+          <w:p>
+            <w:r>
+              <w:rPr>
+                <w:sz w:val="17"/>
+              </w:rPr>
+            </w:r>
+            <w:r>
+              <w:rPr>
+                <w:sz w:val="17"/>
+              </w:rPr>
+              <w:t>Clipboard not cleared when the app is in the background</w:t>
+            </w:r>
+          </w:p>
+        </w:tc>
+        <w:tc>
+          <w:tcPr>
+            <w:tcW w:type="dxa" w:w="2880"/>
+          </w:tcPr>
+          <w:p>
+            <w:r>
+              <w:rPr>
+                <w:sz w:val="17"/>
+              </w:rPr>
+            </w:r>
+            <w:r>
+              <w:rPr>
+                <w:sz w:val="17"/>
+              </w:rPr>
+              <w:t>Fixed; device test open</w:t>
+            </w:r>
+          </w:p>
+        </w:tc>
+      </w:tr>
+      <w:tr>
+        <w:tc>
+          <w:tcPr>
+            <w:tcW w:type="dxa" w:w="2880"/>
+          </w:tcPr>
+          <w:p>
+            <w:r>
+              <w:rPr>
+                <w:sz w:val="17"/>
+              </w:rPr>
+            </w:r>
+            <w:r>
+              <w:rPr>
+                <w:sz w:val="17"/>
+              </w:rPr>
+              <w:t>L5, L6, L10, L11</w:t>
+            </w:r>
+          </w:p>
+        </w:tc>
+        <w:tc>
+          <w:tcPr>
+            <w:tcW w:type="dxa" w:w="2880"/>
+          </w:tcPr>
+          <w:p>
+            <w:r>
+              <w:rPr>
+                <w:sz w:val="17"/>
+              </w:rPr>
+            </w:r>
+            <w:r>
+              <w:rPr>
+                <w:sz w:val="17"/>
+              </w:rPr>
+              <w:t>Unbounded chunk count and packet header, quadratic list parser, PIN pause shortened by moving the date, slow Temp Node connections</w:t>
+            </w:r>
+          </w:p>
+        </w:tc>
+        <w:tc>
+          <w:tcPr>
+            <w:tcW w:type="dxa" w:w="2880"/>
+          </w:tcPr>
+          <w:p>
+            <w:r>
+              <w:rPr>
+                <w:sz w:val="17"/>
+              </w:rPr>
+            </w:r>
+            <w:r>
+              <w:rPr>
+                <w:sz w:val="17"/>
+              </w:rPr>
+              <w:t>Fixed</w:t>
+            </w:r>
+          </w:p>
+        </w:tc>
+      </w:tr>
+      <w:tr>
+        <w:tc>
+          <w:tcPr>
+            <w:tcW w:type="dxa" w:w="2880"/>
+          </w:tcPr>
+          <w:p>
+            <w:r>
+              <w:rPr>
+                <w:sz w:val="17"/>
+              </w:rPr>
+            </w:r>
+            <w:r>
+              <w:rPr>
+                <w:sz w:val="17"/>
+              </w:rPr>
+              <w:t>M4</w:t>
+            </w:r>
+          </w:p>
+        </w:tc>
+        <w:tc>
+          <w:tcPr>
+            <w:tcW w:type="dxa" w:w="2880"/>
+          </w:tcPr>
+          <w:p>
+            <w:r>
+              <w:rPr>
+                <w:sz w:val="17"/>
+              </w:rPr>
+            </w:r>
+            <w:r>
+              <w:rPr>
+                <w:sz w:val="17"/>
+              </w:rPr>
+              <w:t>A node operator can chain a contact's tags over days</w:t>
+            </w:r>
+          </w:p>
+        </w:tc>
+        <w:tc>
+          <w:tcPr>
+            <w:tcW w:type="dxa" w:w="2880"/>
+          </w:tcPr>
+          <w:p>
+            <w:r>
+              <w:rPr>
+                <w:sz w:val="17"/>
+              </w:rPr>
+            </w:r>
+            <w:r>
+              <w:rPr>
+                <w:b/>
+                <w:sz w:val="17"/>
+              </w:rPr>
+              <w:t>Open</w:t>
+            </w:r>
+            <w:r>
+              <w:rPr>
+                <w:sz w:val="17"/>
+              </w:rPr>
+              <w:t>, tied to F1</w:t>
+            </w:r>
+          </w:p>
+        </w:tc>
+      </w:tr>
+      <w:tr>
+        <w:tc>
+          <w:tcPr>
+            <w:tcW w:type="dxa" w:w="2880"/>
+          </w:tcPr>
+          <w:p>
+            <w:r>
+              <w:rPr>
+                <w:sz w:val="17"/>
+              </w:rPr>
+            </w:r>
+            <w:r>
+              <w:rPr>
+                <w:sz w:val="17"/>
+              </w:rPr>
+              <w:t>M5</w:t>
+            </w:r>
+          </w:p>
+        </w:tc>
+        <w:tc>
+          <w:tcPr>
+            <w:tcW w:type="dxa" w:w="2880"/>
+          </w:tcPr>
+          <w:p>
+            <w:r>
+              <w:rPr>
+                <w:sz w:val="17"/>
+              </w:rPr>
+            </w:r>
+            <w:r>
+              <w:rPr>
+                <w:sz w:val="17"/>
+              </w:rPr>
+              <w:t>One write key per server for all company devices</w:t>
+            </w:r>
+          </w:p>
+        </w:tc>
+        <w:tc>
+          <w:tcPr>
+            <w:tcW w:type="dxa" w:w="2880"/>
+          </w:tcPr>
+          <w:p>
+            <w:r>
+              <w:rPr>
+                <w:sz w:val="17"/>
+              </w:rPr>
+            </w:r>
+            <w:r>
+              <w:rPr>
+                <w:b/>
+                <w:sz w:val="17"/>
+              </w:rPr>
+              <w:t>Open</w:t>
+            </w:r>
+            <w:r>
+              <w:rPr>
+                <w:sz w:val="17"/>
+              </w:rPr>
+              <w:t>, design question</w:t>
+            </w:r>
+          </w:p>
+        </w:tc>
+      </w:tr>
+      <w:tr>
+        <w:tc>
+          <w:tcPr>
+            <w:tcW w:type="dxa" w:w="2880"/>
+          </w:tcPr>
+          <w:p>
+            <w:r>
+              <w:rPr>
+                <w:sz w:val="17"/>
+              </w:rPr>
+            </w:r>
+            <w:r>
+              <w:rPr>
+                <w:sz w:val="17"/>
+              </w:rPr>
+              <w:t>M6</w:t>
+            </w:r>
+          </w:p>
+        </w:tc>
+        <w:tc>
+          <w:tcPr>
+            <w:tcW w:type="dxa" w:w="2880"/>
+          </w:tcPr>
+          <w:p>
+            <w:r>
+              <w:rPr>
+                <w:sz w:val="17"/>
+              </w:rPr>
+            </w:r>
+            <w:r>
+              <w:rPr>
+                <w:sz w:val="17"/>
+              </w:rPr>
+              <w:t>Control signals not carried by the ratchet</w:t>
+            </w:r>
+          </w:p>
+        </w:tc>
+        <w:tc>
+          <w:tcPr>
+            <w:tcW w:type="dxa" w:w="2880"/>
+          </w:tcPr>
+          <w:p>
+            <w:r>
+              <w:rPr>
+                <w:sz w:val="17"/>
+              </w:rPr>
+            </w:r>
+            <w:r>
+              <w:rPr>
+                <w:b/>
+                <w:sz w:val="17"/>
+              </w:rPr>
+              <w:t>Open</w:t>
+            </w:r>
+            <w:r>
+              <w:rPr>
+                <w:sz w:val="17"/>
+              </w:rPr>
+              <w:t>, tied to F1</w:t>
+            </w:r>
+          </w:p>
+        </w:tc>
+      </w:tr>
+      <w:tr>
+        <w:tc>
+          <w:tcPr>
+            <w:tcW w:type="dxa" w:w="2880"/>
+          </w:tcPr>
+          <w:p>
+            <w:r>
+              <w:rPr>
+                <w:sz w:val="17"/>
+              </w:rPr>
+            </w:r>
+            <w:r>
+              <w:rPr>
+                <w:sz w:val="17"/>
+              </w:rPr>
+              <w:t>I4</w:t>
+            </w:r>
+          </w:p>
+        </w:tc>
+        <w:tc>
+          <w:tcPr>
+            <w:tcW w:type="dxa" w:w="2880"/>
+          </w:tcPr>
+          <w:p>
+            <w:r>
+              <w:rPr>
+                <w:sz w:val="17"/>
+              </w:rPr>
+            </w:r>
+            <w:r>
+              <w:rPr>
+                <w:sz w:val="17"/>
+              </w:rPr>
+              <w:t>Biometric unlock without a cryptographic object, bypassable on a rooted phone with hooking tools</w:t>
+            </w:r>
+          </w:p>
+        </w:tc>
+        <w:tc>
+          <w:tcPr>
+            <w:tcW w:type="dxa" w:w="2880"/>
+          </w:tcPr>
+          <w:p>
+            <w:r>
+              <w:rPr>
+                <w:sz w:val="17"/>
+              </w:rPr>
+            </w:r>
+            <w:r>
+              <w:rPr>
+                <w:sz w:val="17"/>
+              </w:rPr>
+              <w:t>Known limit</w:t>
+            </w:r>
+          </w:p>
+        </w:tc>
+      </w:tr>
+    </w:tbl>
+    <w:p/>
+    <w:p>
+      <w:r>
+        <w:t xml:space="preserve">Not covered by our own review: any device (normal or rooted), real Tor, bridges and Snowflake, the </w:t>
+      </w:r>
+      <w:r>
+        <w:rPr>
+          <w:rFonts w:ascii="Consolas" w:hAnsi="Consolas"/>
+          <w:sz w:val="18"/>
+        </w:rPr>
+        <w:t>TorManager</w:t>
+      </w:r>
+      <w:r>
+        <w:t>, feed cryptography, a traffic capture, a release APK.</w:t>
       </w:r>
     </w:p>
     <w:sectPr>

</xml_diff>

<commit_message>
M4: poll per contact with a narrow tag window, spread in time (compatible)
Co-Authored-By: Claude Sonnet 5.5 <noreply@anthropic.com>
Claude-Session: https://claude.ai/code/session_011DEBbpPzzheAYqv2omaHb3
</commit_message>
<xml_diff>
--- a/unpruuf/evidence/AUDIT_BRIEF_ANDROID_APP.docx
+++ b/unpruuf/evidence/AUDIT_BRIEF_ANDROID_APP.docx
@@ -656,7 +656,7 @@
               <w:rPr>
                 <w:sz w:val="17"/>
               </w:rPr>
-              <w:t>Review the tag construction and window, the per-contact keys and node choice. Run the real flow on two phones and a server. Note: towards a node operator the 26-hour window lets the tags of one contact be chained over days (pre-audit M4, open, tied to F1).</w:t>
+              <w:t>Review the tag construction and window, the per-contact keys and node choice. Run the real flow on two phones and a server. Note: before 25 October a request listed 26 hourly tags and the tags of several contacts, so a node operator could chain a contact's tags over days (pre-audit M4). Now each contact is asked on its own, for two or three epochs in the steady state (26 after an app start or a gap), with requests spread in time; requests to one node still share Tor's circuit to that address, so an operator can still tie them to one client. Reduced, not closed.</w:t>
             </w:r>
           </w:p>
         </w:tc>
@@ -1604,7 +1604,7 @@
         <w:pStyle w:val="ListBullet"/>
       </w:pPr>
       <w:r>
-        <w:t>Towards a node operator, a contact's hourly tags can be chained over days, because the app asks for the whole 26-hour window and bundles contacts per node (pre-audit M4; decided together with F1).</w:t>
+        <w:t>Towards a node operator, a contact's hourly tags can still be chained over days where the operator can tie the requests to one client: requests to one node address share Tor's circuit, and consecutive requests overlap by one epoch. Since 25 October the app asks per contact for two or three epochs instead of 26 and no longer bundles contacts (pre-audit M4, reduced). Separate circuits per contact (SOCKS isolation) are not built.</w:t>
       </w:r>
     </w:p>
     <w:p>
@@ -2259,7 +2259,7 @@
               <w:rPr>
                 <w:sz w:val="17"/>
               </w:rPr>
-              <w:t>A node operator can chain a contact's tags over days</w:t>
+              <w:t>A node operator can chain a contact's tags over days (26 tags per request, contacts bundled)</w:t>
             </w:r>
           </w:p>
         </w:tc>
@@ -2278,13 +2278,13 @@
                 <w:b/>
                 <w:sz w:val="17"/>
               </w:rPr>
-              <w:t>Open</w:t>
+              <w:t>Reduced</w:t>
             </w:r>
             <w:r>
               <w:rPr>
                 <w:sz w:val="17"/>
               </w:rPr>
-              <w:t>, tied to F1</w:t>
+              <w:t xml:space="preserve"> on 25 Oct: per-contact requests, 2 to 3 epochs, spread in time; chaining via a shared Tor circuit remains</w:t>
             </w:r>
           </w:p>
         </w:tc>

</xml_diff>

<commit_message>
Tor stream isolation per contact (level 1) and per-contact poll timers (level 3)
Co-Authored-By: Claude Sonnet 5.5 <noreply@anthropic.com>
Claude-Session: https://claude.ai/code/session_011DEBbpPzzheAYqv2omaHb3
</commit_message>
<xml_diff>
--- a/unpruuf/evidence/AUDIT_BRIEF_ANDROID_APP.docx
+++ b/unpruuf/evidence/AUDIT_BRIEF_ANDROID_APP.docx
@@ -656,7 +656,7 @@
               <w:rPr>
                 <w:sz w:val="17"/>
               </w:rPr>
-              <w:t>Review the tag construction and window, the per-contact keys and node choice. Run the real flow on two phones and a server. Note: before 25 October a request listed 26 hourly tags and the tags of several contacts, so a node operator could chain a contact's tags over days (pre-audit M4). Now each contact is asked on its own, for two or three epochs in the steady state (26 after an app start or a gap), with requests spread in time; requests to one node still share Tor's circuit to that address, so an operator can still tie them to one client. Reduced, not closed.</w:t>
+              <w:t>Review the tag construction and window, the per-contact keys and node choice. Run the real flow on two phones and a server. Note: before 25 October a request listed 26 hourly tags and the tags of several contacts, so a node operator could chain a contact's tags over days (pre-audit M4). Now each contact is asked on its own, for two or three epochs in the steady state (26 after an app start or a gap), on its own timer, and every request of a contact (fetch and deposit) carries a per-contact SOCKS user name, so that Tor keeps contacts on separate circuits (stream isolation, built 25 October, unit-tested against a fake SOCKS server; not yet verified against real Tor). Consecutive requests of one contact still overlap by one epoch. Reduced, not closed.</w:t>
             </w:r>
           </w:p>
         </w:tc>
@@ -1604,7 +1604,7 @@
         <w:pStyle w:val="ListBullet"/>
       </w:pPr>
       <w:r>
-        <w:t>Towards a node operator, a contact's hourly tags can still be chained over days where the operator can tie the requests to one client: requests to one node address share Tor's circuit, and consecutive requests overlap by one epoch. Since 25 October the app asks per contact for two or three epochs instead of 26 and no longer bundles contacts (pre-audit M4, reduced). Separate circuits per contact (SOCKS isolation) are not built.</w:t>
+        <w:t>Towards a node operator, a contact's hourly tags can still be chained over days where the operator can tie the requests of one contact together: consecutive requests overlap by one epoch, and stream isolation per contact has not been verified against real Tor. Since 25 October the app asks per contact for two or three epochs instead of 26, does not bundle contacts, polls each contact on its own timer and gives each contact its own SOCKS user name (pre-audit M4, reduced). Isolation per hour (one circuit per contact and epoch) is not built.</w:t>
       </w:r>
     </w:p>
     <w:p>
@@ -2284,7 +2284,7 @@
               <w:rPr>
                 <w:sz w:val="17"/>
               </w:rPr>
-              <w:t xml:space="preserve"> on 25 Oct: per-contact requests, 2 to 3 epochs, spread in time; chaining via a shared Tor circuit remains</w:t>
+              <w:t xml:space="preserve"> on 25 Oct: per-contact requests on own timers, 2 to 3 epochs, own SOCKS user name per contact; overlap by one epoch remains; not verified on real Tor</w:t>
             </w:r>
           </w:p>
         </w:tc>

</xml_diff>

<commit_message>
NexonAI design for documents and artifacts (tokens, md_to_html, md_to_docx, CLAUDE.md rule); pre-audit report into the repo
Co-Authored-By: Claude Sonnet 5.5 <noreply@anthropic.com>
Claude-Session: https://claude.ai/code/session_011DEBbpPzzheAYqv2omaHb3
</commit_message>
<xml_diff>
--- a/unpruuf/evidence/AUDIT_BRIEF_ANDROID_APP.docx
+++ b/unpruuf/evidence/AUDIT_BRIEF_ANDROID_APP.docx
@@ -7,6 +7,10 @@
         <w:pStyle w:val="Heading1"/>
       </w:pPr>
       <w:r>
+        <w:rPr>
+          <w:rFonts w:ascii="Open Sans" w:hAnsi="Open Sans"/>
+          <w:color w:val="0F2A3A"/>
+        </w:rPr>
         <w:t>Independent security review: Android app</w:t>
       </w:r>
     </w:p>
@@ -40,8 +44,15 @@
     <w:p>
       <w:pPr>
         <w:pStyle w:val="Heading2"/>
+        <w:pBdr>
+          <w:bottom w:val="single" w:sz="6" w:space="4" w:color="D9E4EA"/>
+        </w:pBdr>
       </w:pPr>
       <w:r>
+        <w:rPr>
+          <w:rFonts w:ascii="Open Sans" w:hAnsi="Open Sans"/>
+          <w:color w:val="0F2A3A"/>
+        </w:rPr>
         <w:t>1. What we want to be able to say afterwards</w:t>
       </w:r>
     </w:p>
@@ -109,8 +120,15 @@
     <w:p>
       <w:pPr>
         <w:pStyle w:val="Heading2"/>
+        <w:pBdr>
+          <w:bottom w:val="single" w:sz="6" w:space="4" w:color="D9E4EA"/>
+        </w:pBdr>
       </w:pPr>
       <w:r>
+        <w:rPr>
+          <w:rFonts w:ascii="Open Sans" w:hAnsi="Open Sans"/>
+          <w:color w:val="0F2A3A"/>
+        </w:rPr>
         <w:t>2. The app in one page</w:t>
       </w:r>
     </w:p>
@@ -131,8 +149,10 @@
       </w:r>
       <w:r>
         <w:rPr>
-          <w:rFonts w:ascii="Consolas" w:hAnsi="Consolas"/>
-          <w:sz w:val="18"/>
+          <w:rFonts w:ascii="DejaVu Sans Mono" w:hAnsi="DejaVu Sans Mono"/>
+          <w:color w:val="0F2A3A"/>
+          <w:sz w:val="17"/>
+          <w:shd w:val="clear" w:color="auto" w:fill="F2F6F9"/>
         </w:rPr>
         <w:t>standard</w:t>
       </w:r>
@@ -141,8 +161,10 @@
       </w:r>
       <w:r>
         <w:rPr>
-          <w:rFonts w:ascii="Consolas" w:hAnsi="Consolas"/>
-          <w:sz w:val="18"/>
+          <w:rFonts w:ascii="DejaVu Sans Mono" w:hAnsi="DejaVu Sans Mono"/>
+          <w:color w:val="0F2A3A"/>
+          <w:sz w:val="17"/>
+          <w:shd w:val="clear" w:color="auto" w:fill="F2F6F9"/>
         </w:rPr>
         <w:t>pro</w:t>
       </w:r>
@@ -151,8 +173,10 @@
       </w:r>
       <w:r>
         <w:rPr>
-          <w:rFonts w:ascii="Consolas" w:hAnsi="Consolas"/>
-          <w:sz w:val="18"/>
+          <w:rFonts w:ascii="DejaVu Sans Mono" w:hAnsi="DejaVu Sans Mono"/>
+          <w:color w:val="0F2A3A"/>
+          <w:sz w:val="17"/>
+          <w:shd w:val="clear" w:color="auto" w:fill="F2F6F9"/>
         </w:rPr>
         <w:t>client</w:t>
       </w:r>
@@ -161,8 +185,10 @@
       </w:r>
       <w:r>
         <w:rPr>
-          <w:rFonts w:ascii="Consolas" w:hAnsi="Consolas"/>
-          <w:sz w:val="18"/>
+          <w:rFonts w:ascii="DejaVu Sans Mono" w:hAnsi="DejaVu Sans Mono"/>
+          <w:color w:val="0F2A3A"/>
+          <w:sz w:val="17"/>
+          <w:shd w:val="clear" w:color="auto" w:fill="F2F6F9"/>
         </w:rPr>
         <w:t>group</w:t>
       </w:r>
@@ -171,8 +197,10 @@
       </w:r>
       <w:r>
         <w:rPr>
-          <w:rFonts w:ascii="Consolas" w:hAnsi="Consolas"/>
-          <w:sz w:val="18"/>
+          <w:rFonts w:ascii="DejaVu Sans Mono" w:hAnsi="DejaVu Sans Mono"/>
+          <w:color w:val="0F2A3A"/>
+          <w:sz w:val="17"/>
+          <w:shd w:val="clear" w:color="auto" w:fill="F2F6F9"/>
         </w:rPr>
         <w:t>whistleblower</w:t>
       </w:r>
@@ -181,8 +209,10 @@
       </w:r>
       <w:r>
         <w:rPr>
-          <w:rFonts w:ascii="Consolas" w:hAnsi="Consolas"/>
-          <w:sz w:val="18"/>
+          <w:rFonts w:ascii="DejaVu Sans Mono" w:hAnsi="DejaVu Sans Mono"/>
+          <w:color w:val="0F2A3A"/>
+          <w:sz w:val="17"/>
+          <w:shd w:val="clear" w:color="auto" w:fill="F2F6F9"/>
         </w:rPr>
         <w:t>press</w:t>
       </w:r>
@@ -200,8 +230,10 @@
       </w:r>
       <w:r>
         <w:rPr>
-          <w:rFonts w:ascii="Consolas" w:hAnsi="Consolas"/>
-          <w:sz w:val="18"/>
+          <w:rFonts w:ascii="DejaVu Sans Mono" w:hAnsi="DejaVu Sans Mono"/>
+          <w:color w:val="0F2A3A"/>
+          <w:sz w:val="17"/>
+          <w:shd w:val="clear" w:color="auto" w:fill="F2F6F9"/>
         </w:rPr>
         <w:t>whistleblower</w:t>
       </w:r>
@@ -210,8 +242,10 @@
       </w:r>
       <w:r>
         <w:rPr>
-          <w:rFonts w:ascii="Consolas" w:hAnsi="Consolas"/>
-          <w:sz w:val="18"/>
+          <w:rFonts w:ascii="DejaVu Sans Mono" w:hAnsi="DejaVu Sans Mono"/>
+          <w:color w:val="0F2A3A"/>
+          <w:sz w:val="17"/>
+          <w:shd w:val="clear" w:color="auto" w:fill="F2F6F9"/>
         </w:rPr>
         <w:t>press</w:t>
       </w:r>
@@ -270,8 +304,15 @@
     <w:p>
       <w:pPr>
         <w:pStyle w:val="Heading2"/>
+        <w:pBdr>
+          <w:bottom w:val="single" w:sz="6" w:space="4" w:color="D9E4EA"/>
+        </w:pBdr>
       </w:pPr>
       <w:r>
+        <w:rPr>
+          <w:rFonts w:ascii="Open Sans" w:hAnsi="Open Sans"/>
+          <w:color w:val="0F2A3A"/>
+        </w:rPr>
         <w:t>3. Preconditions NexonAI completes before kick-off</w:t>
       </w:r>
     </w:p>
@@ -319,8 +360,15 @@
     <w:p>
       <w:pPr>
         <w:pStyle w:val="Heading2"/>
+        <w:pBdr>
+          <w:bottom w:val="single" w:sz="6" w:space="4" w:color="D9E4EA"/>
+        </w:pBdr>
       </w:pPr>
       <w:r>
+        <w:rPr>
+          <w:rFonts w:ascii="Open Sans" w:hAnsi="Open Sans"/>
+          <w:color w:val="0F2A3A"/>
+        </w:rPr>
         <w:t>4. Claims to test</w:t>
       </w:r>
     </w:p>
@@ -330,8 +378,10 @@
       </w:r>
       <w:r>
         <w:rPr>
-          <w:rFonts w:ascii="Consolas" w:hAnsi="Consolas"/>
-          <w:sz w:val="18"/>
+          <w:rFonts w:ascii="DejaVu Sans Mono" w:hAnsi="DejaVu Sans Mono"/>
+          <w:color w:val="0F2A3A"/>
+          <w:sz w:val="17"/>
+          <w:shd w:val="clear" w:color="auto" w:fill="F2F6F9"/>
         </w:rPr>
         <w:t>evidence/CLAIMS_TO_EVIDENCE.md</w:t>
       </w:r>
@@ -341,31 +391,37 @@
     </w:p>
     <w:tbl>
       <w:tblPr>
-        <w:tblStyle w:val="TableGrid"/>
         <w:tblW w:type="auto" w:w="0"/>
         <w:tblLook w:firstColumn="1" w:firstRow="1" w:lastColumn="0" w:lastRow="0" w:noHBand="0" w:noVBand="1" w:val="04A0"/>
+        <w:tblBorders>
+          <w:top w:val="single" w:sz="6" w:space="0" w:color="D9E4EA"/>
+          <w:bottom w:val="single" w:sz="6" w:space="0" w:color="D9E4EA"/>
+          <w:insideH w:val="single" w:sz="6" w:space="0" w:color="D9E4EA"/>
+        </w:tblBorders>
       </w:tblPr>
       <w:tblGrid>
-        <w:gridCol w:w="2160"/>
-        <w:gridCol w:w="2160"/>
-        <w:gridCol w:w="2160"/>
-        <w:gridCol w:w="2160"/>
+        <w:gridCol w:w="2436"/>
+        <w:gridCol w:w="2436"/>
+        <w:gridCol w:w="2436"/>
+        <w:gridCol w:w="2436"/>
       </w:tblGrid>
       <w:tr>
         <w:tc>
           <w:tcPr>
-            <w:tcW w:type="dxa" w:w="2160"/>
-            <w:shd w:val="clear" w:color="auto" w:fill="E7ECEF"/>
+            <w:tcW w:type="dxa" w:w="2436"/>
+            <w:shd w:val="clear" w:color="auto" w:fill="F2F6F9"/>
           </w:tcPr>
           <w:p>
             <w:r>
               <w:rPr>
+                <w:rFonts w:ascii="Open Sans" w:hAnsi="Open Sans"/>
                 <w:b/>
                 <w:sz w:val="17"/>
               </w:rPr>
             </w:r>
             <w:r>
               <w:rPr>
+                <w:rFonts w:ascii="Open Sans" w:hAnsi="Open Sans"/>
                 <w:b/>
                 <w:sz w:val="17"/>
               </w:rPr>
@@ -375,18 +431,20 @@
         </w:tc>
         <w:tc>
           <w:tcPr>
-            <w:tcW w:type="dxa" w:w="2160"/>
-            <w:shd w:val="clear" w:color="auto" w:fill="E7ECEF"/>
+            <w:tcW w:type="dxa" w:w="2436"/>
+            <w:shd w:val="clear" w:color="auto" w:fill="F2F6F9"/>
           </w:tcPr>
           <w:p>
             <w:r>
               <w:rPr>
+                <w:rFonts w:ascii="Open Sans" w:hAnsi="Open Sans"/>
                 <w:b/>
                 <w:sz w:val="17"/>
               </w:rPr>
             </w:r>
             <w:r>
               <w:rPr>
+                <w:rFonts w:ascii="Open Sans" w:hAnsi="Open Sans"/>
                 <w:b/>
                 <w:sz w:val="17"/>
               </w:rPr>
@@ -396,18 +454,20 @@
         </w:tc>
         <w:tc>
           <w:tcPr>
-            <w:tcW w:type="dxa" w:w="2160"/>
-            <w:shd w:val="clear" w:color="auto" w:fill="E7ECEF"/>
+            <w:tcW w:type="dxa" w:w="2436"/>
+            <w:shd w:val="clear" w:color="auto" w:fill="F2F6F9"/>
           </w:tcPr>
           <w:p>
             <w:r>
               <w:rPr>
+                <w:rFonts w:ascii="Open Sans" w:hAnsi="Open Sans"/>
                 <w:b/>
                 <w:sz w:val="17"/>
               </w:rPr>
             </w:r>
             <w:r>
               <w:rPr>
+                <w:rFonts w:ascii="Open Sans" w:hAnsi="Open Sans"/>
                 <w:b/>
                 <w:sz w:val="17"/>
               </w:rPr>
@@ -417,18 +477,20 @@
         </w:tc>
         <w:tc>
           <w:tcPr>
-            <w:tcW w:type="dxa" w:w="2160"/>
-            <w:shd w:val="clear" w:color="auto" w:fill="E7ECEF"/>
+            <w:tcW w:type="dxa" w:w="2436"/>
+            <w:shd w:val="clear" w:color="auto" w:fill="F2F6F9"/>
           </w:tcPr>
           <w:p>
             <w:r>
               <w:rPr>
+                <w:rFonts w:ascii="Open Sans" w:hAnsi="Open Sans"/>
                 <w:b/>
                 <w:sz w:val="17"/>
               </w:rPr>
             </w:r>
             <w:r>
               <w:rPr>
+                <w:rFonts w:ascii="Open Sans" w:hAnsi="Open Sans"/>
                 <w:b/>
                 <w:sz w:val="17"/>
               </w:rPr>
@@ -440,16 +502,20 @@
       <w:tr>
         <w:tc>
           <w:tcPr>
-            <w:tcW w:type="dxa" w:w="2160"/>
+            <w:tcW w:type="dxa" w:w="2436"/>
           </w:tcPr>
           <w:p>
             <w:r>
               <w:rPr>
+                <w:rFonts w:ascii="DejaVu Sans Mono" w:hAnsi="DejaVu Sans Mono"/>
+                <w:color w:val="307098"/>
                 <w:sz w:val="17"/>
               </w:rPr>
             </w:r>
             <w:r>
               <w:rPr>
+                <w:rFonts w:ascii="DejaVu Sans Mono" w:hAnsi="DejaVu Sans Mono"/>
+                <w:color w:val="307098"/>
                 <w:sz w:val="17"/>
               </w:rPr>
               <w:t>A1</w:t>
@@ -458,16 +524,18 @@
         </w:tc>
         <w:tc>
           <w:tcPr>
-            <w:tcW w:type="dxa" w:w="2160"/>
+            <w:tcW w:type="dxa" w:w="2436"/>
           </w:tcPr>
           <w:p>
             <w:r>
               <w:rPr>
+                <w:rFonts w:ascii="Open Sans" w:hAnsi="Open Sans"/>
                 <w:sz w:val="17"/>
               </w:rPr>
             </w:r>
             <w:r>
               <w:rPr>
+                <w:rFonts w:ascii="Open Sans" w:hAnsi="Open Sans"/>
                 <w:sz w:val="17"/>
               </w:rPr>
               <w:t>No identities. The pairing code has no user id and the contact record has no phone, e-mail or account. No analytics, advertising or Google services library. Eleven permissions in the merged manifest (nine of ours and two, USE_BIOMETRIC and USE_FINGERPRINT, from the biometric library), none for contacts, location, phone, SMS, microphone, accounts, calendar or storage.</w:t>
@@ -476,16 +544,18 @@
         </w:tc>
         <w:tc>
           <w:tcPr>
-            <w:tcW w:type="dxa" w:w="2160"/>
+            <w:tcW w:type="dxa" w:w="2436"/>
           </w:tcPr>
           <w:p>
             <w:r>
               <w:rPr>
+                <w:rFonts w:ascii="Open Sans" w:hAnsi="Open Sans"/>
                 <w:sz w:val="17"/>
               </w:rPr>
             </w:r>
             <w:r>
               <w:rPr>
+                <w:rFonts w:ascii="Open Sans" w:hAnsi="Open Sans"/>
                 <w:sz w:val="17"/>
               </w:rPr>
               <w:t>Review manifest, dependencies and the code that builds and reads pairing codes. Confirm on the release APK.</w:t>
@@ -494,37 +564,44 @@
         </w:tc>
         <w:tc>
           <w:tcPr>
-            <w:tcW w:type="dxa" w:w="2160"/>
+            <w:tcW w:type="dxa" w:w="2436"/>
           </w:tcPr>
           <w:p>
             <w:r>
               <w:rPr>
+                <w:rFonts w:ascii="Open Sans" w:hAnsi="Open Sans"/>
                 <w:sz w:val="17"/>
               </w:rPr>
             </w:r>
             <w:r>
               <w:rPr>
+                <w:rFonts w:ascii="Open Sans" w:hAnsi="Open Sans"/>
                 <w:sz w:val="17"/>
               </w:rPr>
               <w:t xml:space="preserve">B1 to B8, B11; scripts </w:t>
             </w:r>
             <w:r>
               <w:rPr>
-                <w:rFonts w:ascii="Consolas" w:hAnsi="Consolas"/>
+                <w:rFonts w:ascii="DejaVu Sans Mono" w:hAnsi="DejaVu Sans Mono"/>
+                <w:color w:val="0F2A3A"/>
                 <w:sz w:val="17"/>
+                <w:shd w:val="clear" w:color="auto" w:fill="F2F6F9"/>
               </w:rPr>
               <w:t>04</w:t>
             </w:r>
             <w:r>
               <w:rPr>
+                <w:rFonts w:ascii="Open Sans" w:hAnsi="Open Sans"/>
                 <w:sz w:val="17"/>
               </w:rPr>
               <w:t xml:space="preserve">, </w:t>
             </w:r>
             <w:r>
               <w:rPr>
-                <w:rFonts w:ascii="Consolas" w:hAnsi="Consolas"/>
+                <w:rFonts w:ascii="DejaVu Sans Mono" w:hAnsi="DejaVu Sans Mono"/>
+                <w:color w:val="0F2A3A"/>
                 <w:sz w:val="17"/>
+                <w:shd w:val="clear" w:color="auto" w:fill="F2F6F9"/>
               </w:rPr>
               <w:t>06</w:t>
             </w:r>
@@ -534,16 +611,20 @@
       <w:tr>
         <w:tc>
           <w:tcPr>
-            <w:tcW w:type="dxa" w:w="2160"/>
+            <w:tcW w:type="dxa" w:w="2436"/>
           </w:tcPr>
           <w:p>
             <w:r>
               <w:rPr>
+                <w:rFonts w:ascii="DejaVu Sans Mono" w:hAnsi="DejaVu Sans Mono"/>
+                <w:color w:val="307098"/>
                 <w:sz w:val="17"/>
               </w:rPr>
             </w:r>
             <w:r>
               <w:rPr>
+                <w:rFonts w:ascii="DejaVu Sans Mono" w:hAnsi="DejaVu Sans Mono"/>
+                <w:color w:val="307098"/>
                 <w:sz w:val="17"/>
               </w:rPr>
               <w:t>A2</w:t>
@@ -552,16 +633,18 @@
         </w:tc>
         <w:tc>
           <w:tcPr>
-            <w:tcW w:type="dxa" w:w="2160"/>
+            <w:tcW w:type="dxa" w:w="2436"/>
           </w:tcPr>
           <w:p>
             <w:r>
               <w:rPr>
+                <w:rFonts w:ascii="Open Sans" w:hAnsi="Open Sans"/>
                 <w:sz w:val="17"/>
               </w:rPr>
             </w:r>
             <w:r>
               <w:rPr>
+                <w:rFonts w:ascii="Open Sans" w:hAnsi="Open Sans"/>
                 <w:sz w:val="17"/>
               </w:rPr>
               <w:t>Network traffic goes through Tor only. A same-Wi-Fi shortcut exists only for direct contacts, never for Business or whistleblower.</w:t>
@@ -570,16 +653,18 @@
         </w:tc>
         <w:tc>
           <w:tcPr>
-            <w:tcW w:type="dxa" w:w="2160"/>
+            <w:tcW w:type="dxa" w:w="2436"/>
           </w:tcPr>
           <w:p>
             <w:r>
               <w:rPr>
+                <w:rFonts w:ascii="Open Sans" w:hAnsi="Open Sans"/>
                 <w:sz w:val="17"/>
               </w:rPr>
             </w:r>
             <w:r>
               <w:rPr>
+                <w:rFonts w:ascii="Open Sans" w:hAnsi="Open Sans"/>
                 <w:sz w:val="17"/>
               </w:rPr>
               <w:t>Capture the traffic of a phone for several hours with Business contacts. Test a network that blocks Tor (bridges, Snowflake) and name every third party contacted on those paths.</w:t>
@@ -588,16 +673,18 @@
         </w:tc>
         <w:tc>
           <w:tcPr>
-            <w:tcW w:type="dxa" w:w="2160"/>
+            <w:tcW w:type="dxa" w:w="2436"/>
           </w:tcPr>
           <w:p>
             <w:r>
               <w:rPr>
+                <w:rFonts w:ascii="Open Sans" w:hAnsi="Open Sans"/>
                 <w:sz w:val="17"/>
               </w:rPr>
             </w:r>
             <w:r>
               <w:rPr>
+                <w:rFonts w:ascii="Open Sans" w:hAnsi="Open Sans"/>
                 <w:sz w:val="17"/>
               </w:rPr>
               <w:t>B7, B9 (code only; no capture yet). Since 25 Oct the app accepts only v3 onion addresses (pairing codes, node lists, owner strings, migration signals) and the transport refuses any other host; unit-tested</w:t>
@@ -608,16 +695,20 @@
       <w:tr>
         <w:tc>
           <w:tcPr>
-            <w:tcW w:type="dxa" w:w="2160"/>
+            <w:tcW w:type="dxa" w:w="2436"/>
           </w:tcPr>
           <w:p>
             <w:r>
               <w:rPr>
+                <w:rFonts w:ascii="DejaVu Sans Mono" w:hAnsi="DejaVu Sans Mono"/>
+                <w:color w:val="307098"/>
                 <w:sz w:val="17"/>
               </w:rPr>
             </w:r>
             <w:r>
               <w:rPr>
+                <w:rFonts w:ascii="DejaVu Sans Mono" w:hAnsi="DejaVu Sans Mono"/>
+                <w:color w:val="307098"/>
                 <w:sz w:val="17"/>
               </w:rPr>
               <w:t>A3</w:t>
@@ -626,16 +717,18 @@
         </w:tc>
         <w:tc>
           <w:tcPr>
-            <w:tcW w:type="dxa" w:w="2160"/>
+            <w:tcW w:type="dxa" w:w="2436"/>
           </w:tcPr>
           <w:p>
             <w:r>
               <w:rPr>
+                <w:rFonts w:ascii="Open Sans" w:hAnsi="Open Sans"/>
                 <w:sz w:val="17"/>
               </w:rPr>
             </w:r>
             <w:r>
               <w:rPr>
+                <w:rFonts w:ascii="Open Sans" w:hAnsi="Open Sans"/>
                 <w:sz w:val="17"/>
               </w:rPr>
               <w:t>Routing tags are computable only by the two partners, change every hour and cannot be linked across contacts. Writing needs the owner secret, reading needs the tag.</w:t>
@@ -644,16 +737,18 @@
         </w:tc>
         <w:tc>
           <w:tcPr>
-            <w:tcW w:type="dxa" w:w="2160"/>
+            <w:tcW w:type="dxa" w:w="2436"/>
           </w:tcPr>
           <w:p>
             <w:r>
               <w:rPr>
+                <w:rFonts w:ascii="Open Sans" w:hAnsi="Open Sans"/>
                 <w:sz w:val="17"/>
               </w:rPr>
             </w:r>
             <w:r>
               <w:rPr>
+                <w:rFonts w:ascii="Open Sans" w:hAnsi="Open Sans"/>
                 <w:sz w:val="17"/>
               </w:rPr>
               <w:t>Review the tag construction and window, the per-contact keys and node choice. Run the real flow on two phones and a server. Note: before 25 October a request listed 26 hourly tags and the tags of several contacts, so a node operator could chain a contact's tags over days (pre-audit M4). Now each contact is asked on its own, for two or three epochs in the steady state (26 after an app start or a gap), on its own timer, and every request of a contact (fetch and deposit) carries a per-contact SOCKS user name, so that Tor keeps contacts on separate circuits (stream isolation, built 25 October, unit-tested against a fake SOCKS server; not yet verified against real Tor). Consecutive requests of one contact still overlap by one epoch. Reduced, not closed.</w:t>
@@ -662,29 +757,34 @@
         </w:tc>
         <w:tc>
           <w:tcPr>
-            <w:tcW w:type="dxa" w:w="2160"/>
+            <w:tcW w:type="dxa" w:w="2436"/>
           </w:tcPr>
           <w:p>
             <w:r>
               <w:rPr>
+                <w:rFonts w:ascii="Open Sans" w:hAnsi="Open Sans"/>
                 <w:sz w:val="17"/>
               </w:rPr>
             </w:r>
             <w:r>
               <w:rPr>
+                <w:rFonts w:ascii="Open Sans" w:hAnsi="Open Sans"/>
                 <w:sz w:val="17"/>
               </w:rPr>
               <w:t xml:space="preserve">B2, B3; script </w:t>
             </w:r>
             <w:r>
               <w:rPr>
-                <w:rFonts w:ascii="Consolas" w:hAnsi="Consolas"/>
+                <w:rFonts w:ascii="DejaVu Sans Mono" w:hAnsi="DejaVu Sans Mono"/>
+                <w:color w:val="0F2A3A"/>
                 <w:sz w:val="17"/>
+                <w:shd w:val="clear" w:color="auto" w:fill="F2F6F9"/>
               </w:rPr>
               <w:t>05</w:t>
             </w:r>
             <w:r>
               <w:rPr>
+                <w:rFonts w:ascii="Open Sans" w:hAnsi="Open Sans"/>
                 <w:sz w:val="17"/>
               </w:rPr>
               <w:t>; no third-party run</w:t>
@@ -695,16 +795,20 @@
       <w:tr>
         <w:tc>
           <w:tcPr>
-            <w:tcW w:type="dxa" w:w="2160"/>
+            <w:tcW w:type="dxa" w:w="2436"/>
           </w:tcPr>
           <w:p>
             <w:r>
               <w:rPr>
+                <w:rFonts w:ascii="DejaVu Sans Mono" w:hAnsi="DejaVu Sans Mono"/>
+                <w:color w:val="307098"/>
                 <w:sz w:val="17"/>
               </w:rPr>
             </w:r>
             <w:r>
               <w:rPr>
+                <w:rFonts w:ascii="DejaVu Sans Mono" w:hAnsi="DejaVu Sans Mono"/>
+                <w:color w:val="307098"/>
                 <w:sz w:val="17"/>
               </w:rPr>
               <w:t>A4</w:t>
@@ -713,16 +817,18 @@
         </w:tc>
         <w:tc>
           <w:tcPr>
-            <w:tcW w:type="dxa" w:w="2160"/>
+            <w:tcW w:type="dxa" w:w="2436"/>
           </w:tcPr>
           <w:p>
             <w:r>
               <w:rPr>
+                <w:rFonts w:ascii="Open Sans" w:hAnsi="Open Sans"/>
                 <w:sz w:val="17"/>
               </w:rPr>
             </w:r>
             <w:r>
               <w:rPr>
+                <w:rFonts w:ascii="Open Sans" w:hAnsi="Open Sans"/>
                 <w:sz w:val="17"/>
               </w:rPr>
               <w:t>Messages are never on disk.</w:t>
@@ -731,16 +837,18 @@
         </w:tc>
         <w:tc>
           <w:tcPr>
-            <w:tcW w:type="dxa" w:w="2160"/>
+            <w:tcW w:type="dxa" w:w="2436"/>
           </w:tcPr>
           <w:p>
             <w:r>
               <w:rPr>
+                <w:rFonts w:ascii="Open Sans" w:hAnsi="Open Sans"/>
                 <w:sz w:val="17"/>
               </w:rPr>
             </w:r>
             <w:r>
               <w:rPr>
+                <w:rFonts w:ascii="Open Sans" w:hAnsi="Open Sans"/>
                 <w:sz w:val="17"/>
               </w:rPr>
               <w:t>Take a forensic image of a phone after use, with and without root. Search the image for message text. Review the memory handling and its limits (strings made for the screen cannot be overwritten).</w:t>
@@ -749,16 +857,18 @@
         </w:tc>
         <w:tc>
           <w:tcPr>
-            <w:tcW w:type="dxa" w:w="2160"/>
+            <w:tcW w:type="dxa" w:w="2436"/>
           </w:tcPr>
           <w:p>
             <w:r>
               <w:rPr>
+                <w:rFonts w:ascii="Open Sans" w:hAnsi="Open Sans"/>
                 <w:sz w:val="17"/>
               </w:rPr>
             </w:r>
             <w:r>
               <w:rPr>
+                <w:rFonts w:ascii="Open Sans" w:hAnsi="Open Sans"/>
                 <w:sz w:val="17"/>
               </w:rPr>
               <w:t>D1 (read only)</w:t>
@@ -769,16 +879,20 @@
       <w:tr>
         <w:tc>
           <w:tcPr>
-            <w:tcW w:type="dxa" w:w="2160"/>
+            <w:tcW w:type="dxa" w:w="2436"/>
           </w:tcPr>
           <w:p>
             <w:r>
               <w:rPr>
+                <w:rFonts w:ascii="DejaVu Sans Mono" w:hAnsi="DejaVu Sans Mono"/>
+                <w:color w:val="307098"/>
                 <w:sz w:val="17"/>
               </w:rPr>
             </w:r>
             <w:r>
               <w:rPr>
+                <w:rFonts w:ascii="DejaVu Sans Mono" w:hAnsi="DejaVu Sans Mono"/>
+                <w:color w:val="307098"/>
                 <w:sz w:val="17"/>
               </w:rPr>
               <w:t>A5</w:t>
@@ -787,16 +901,18 @@
         </w:tc>
         <w:tc>
           <w:tcPr>
-            <w:tcW w:type="dxa" w:w="2160"/>
+            <w:tcW w:type="dxa" w:w="2436"/>
           </w:tcPr>
           <w:p>
             <w:r>
               <w:rPr>
+                <w:rFonts w:ascii="Open Sans" w:hAnsi="Open Sans"/>
                 <w:sz w:val="17"/>
               </w:rPr>
             </w:r>
             <w:r>
               <w:rPr>
+                <w:rFonts w:ascii="Open Sans" w:hAnsi="Open Sans"/>
                 <w:sz w:val="17"/>
               </w:rPr>
               <w:t>Secrets are protected at rest: ratchet and onion keys, owner secrets of own nodes, node lists, feed keys, relay token. The database is encrypted, and its key is sealed under the phone-bound key (since 25 October 2026; before that it lay in clear next to the database, pre-audit H1).</w:t>
@@ -805,94 +921,114 @@
         </w:tc>
         <w:tc>
           <w:tcPr>
-            <w:tcW w:type="dxa" w:w="2160"/>
+            <w:tcW w:type="dxa" w:w="2436"/>
           </w:tcPr>
           <w:p>
             <w:r>
               <w:rPr>
+                <w:rFonts w:ascii="Open Sans" w:hAnsi="Open Sans"/>
                 <w:sz w:val="17"/>
               </w:rPr>
             </w:r>
             <w:r>
               <w:rPr>
+                <w:rFonts w:ascii="Open Sans" w:hAnsi="Open Sans"/>
                 <w:sz w:val="17"/>
               </w:rPr>
               <w:t>Review the key store use (</w:t>
             </w:r>
             <w:r>
               <w:rPr>
-                <w:rFonts w:ascii="Consolas" w:hAnsi="Consolas"/>
+                <w:rFonts w:ascii="DejaVu Sans Mono" w:hAnsi="DejaVu Sans Mono"/>
+                <w:color w:val="0F2A3A"/>
                 <w:sz w:val="17"/>
+                <w:shd w:val="clear" w:color="auto" w:fill="F2F6F9"/>
               </w:rPr>
               <w:t>CryptoManager</w:t>
             </w:r>
             <w:r>
               <w:rPr>
+                <w:rFonts w:ascii="Open Sans" w:hAnsi="Open Sans"/>
                 <w:sz w:val="17"/>
               </w:rPr>
               <w:t xml:space="preserve">, </w:t>
             </w:r>
             <w:r>
               <w:rPr>
-                <w:rFonts w:ascii="Consolas" w:hAnsi="Consolas"/>
+                <w:rFonts w:ascii="DejaVu Sans Mono" w:hAnsi="DejaVu Sans Mono"/>
+                <w:color w:val="0F2A3A"/>
                 <w:sz w:val="17"/>
+                <w:shd w:val="clear" w:color="auto" w:fill="F2F6F9"/>
               </w:rPr>
               <w:t>SealedStrings</w:t>
             </w:r>
             <w:r>
               <w:rPr>
+                <w:rFonts w:ascii="Open Sans" w:hAnsi="Open Sans"/>
                 <w:sz w:val="17"/>
               </w:rPr>
               <w:t xml:space="preserve">, </w:t>
             </w:r>
             <w:r>
               <w:rPr>
-                <w:rFonts w:ascii="Consolas" w:hAnsi="Consolas"/>
+                <w:rFonts w:ascii="DejaVu Sans Mono" w:hAnsi="DejaVu Sans Mono"/>
+                <w:color w:val="0F2A3A"/>
                 <w:sz w:val="17"/>
+                <w:shd w:val="clear" w:color="auto" w:fill="F2F6F9"/>
               </w:rPr>
               <w:t>DbKeyVault</w:t>
             </w:r>
             <w:r>
               <w:rPr>
+                <w:rFonts w:ascii="Open Sans" w:hAnsi="Open Sans"/>
                 <w:sz w:val="17"/>
               </w:rPr>
               <w:t xml:space="preserve">, </w:t>
             </w:r>
             <w:r>
               <w:rPr>
-                <w:rFonts w:ascii="Consolas" w:hAnsi="Consolas"/>
+                <w:rFonts w:ascii="DejaVu Sans Mono" w:hAnsi="DejaVu Sans Mono"/>
+                <w:color w:val="0F2A3A"/>
                 <w:sz w:val="17"/>
+                <w:shd w:val="clear" w:color="auto" w:fill="F2F6F9"/>
               </w:rPr>
               <w:t>IdentityManager</w:t>
             </w:r>
             <w:r>
               <w:rPr>
+                <w:rFonts w:ascii="Open Sans" w:hAnsi="Open Sans"/>
                 <w:sz w:val="17"/>
               </w:rPr>
               <w:t xml:space="preserve">, </w:t>
             </w:r>
             <w:r>
               <w:rPr>
-                <w:rFonts w:ascii="Consolas" w:hAnsi="Consolas"/>
+                <w:rFonts w:ascii="DejaVu Sans Mono" w:hAnsi="DejaVu Sans Mono"/>
+                <w:color w:val="0F2A3A"/>
                 <w:sz w:val="17"/>
+                <w:shd w:val="clear" w:color="auto" w:fill="F2F6F9"/>
               </w:rPr>
               <w:t>PinManager</w:t>
             </w:r>
             <w:r>
               <w:rPr>
+                <w:rFonts w:ascii="Open Sans" w:hAnsi="Open Sans"/>
                 <w:sz w:val="17"/>
               </w:rPr>
               <w:t>), the SQLCipher key handling and migration, backup and device-transfer settings (</w:t>
             </w:r>
             <w:r>
               <w:rPr>
-                <w:rFonts w:ascii="Consolas" w:hAnsi="Consolas"/>
+                <w:rFonts w:ascii="DejaVu Sans Mono" w:hAnsi="DejaVu Sans Mono"/>
+                <w:color w:val="0F2A3A"/>
                 <w:sz w:val="17"/>
+                <w:shd w:val="clear" w:color="auto" w:fill="F2F6F9"/>
               </w:rPr>
               <w:t>dataExtractionRules</w:t>
             </w:r>
             <w:r>
               <w:rPr>
+                <w:rFonts w:ascii="Open Sans" w:hAnsi="Open Sans"/>
                 <w:sz w:val="17"/>
               </w:rPr>
               <w:t>) and what remains in clear. Check upgrades from older versions; old key material may remain in flash.</w:t>
@@ -901,29 +1037,34 @@
         </w:tc>
         <w:tc>
           <w:tcPr>
-            <w:tcW w:type="dxa" w:w="2160"/>
+            <w:tcW w:type="dxa" w:w="2436"/>
           </w:tcPr>
           <w:p>
             <w:r>
               <w:rPr>
+                <w:rFonts w:ascii="Open Sans" w:hAnsi="Open Sans"/>
                 <w:sz w:val="17"/>
               </w:rPr>
             </w:r>
             <w:r>
               <w:rPr>
+                <w:rFonts w:ascii="Open Sans" w:hAnsi="Open Sans"/>
                 <w:sz w:val="17"/>
               </w:rPr>
               <w:t xml:space="preserve">D2, Tier 2 in </w:t>
             </w:r>
             <w:r>
               <w:rPr>
-                <w:rFonts w:ascii="Consolas" w:hAnsi="Consolas"/>
+                <w:rFonts w:ascii="DejaVu Sans Mono" w:hAnsi="DejaVu Sans Mono"/>
+                <w:color w:val="0F2A3A"/>
                 <w:sz w:val="17"/>
+                <w:shd w:val="clear" w:color="auto" w:fill="F2F6F9"/>
               </w:rPr>
               <w:t>SECURITY_CLAIMS.md</w:t>
             </w:r>
             <w:r>
               <w:rPr>
+                <w:rFonts w:ascii="Open Sans" w:hAnsi="Open Sans"/>
                 <w:sz w:val="17"/>
               </w:rPr>
               <w:t>; 15 migration tests (logic only; SQLCipher and Keystore are not covered by unit tests); device test open</w:t>
@@ -934,16 +1075,20 @@
       <w:tr>
         <w:tc>
           <w:tcPr>
-            <w:tcW w:type="dxa" w:w="2160"/>
+            <w:tcW w:type="dxa" w:w="2436"/>
           </w:tcPr>
           <w:p>
             <w:r>
               <w:rPr>
+                <w:rFonts w:ascii="DejaVu Sans Mono" w:hAnsi="DejaVu Sans Mono"/>
+                <w:color w:val="307098"/>
                 <w:sz w:val="17"/>
               </w:rPr>
             </w:r>
             <w:r>
               <w:rPr>
+                <w:rFonts w:ascii="DejaVu Sans Mono" w:hAnsi="DejaVu Sans Mono"/>
+                <w:color w:val="307098"/>
                 <w:sz w:val="17"/>
               </w:rPr>
               <w:t>A6</w:t>
@@ -952,16 +1097,18 @@
         </w:tc>
         <w:tc>
           <w:tcPr>
-            <w:tcW w:type="dxa" w:w="2160"/>
+            <w:tcW w:type="dxa" w:w="2436"/>
           </w:tcPr>
           <w:p>
             <w:r>
               <w:rPr>
+                <w:rFonts w:ascii="Open Sans" w:hAnsi="Open Sans"/>
                 <w:sz w:val="17"/>
               </w:rPr>
             </w:r>
             <w:r>
               <w:rPr>
+                <w:rFonts w:ascii="Open Sans" w:hAnsi="Open Sans"/>
                 <w:sz w:val="17"/>
               </w:rPr>
               <w:t>The panic PIN removes contacts, sessions, onion keys, groups, own nodes, node lists, feed sources, relay setup and the organisation code; since 25 October also the pairing code on screen, queued messages and partial transfers, and the database is cleaned (secure delete, checkpoint, vacuum). The identity keys, licence and PINs stay. Wrong PINs lock the pad (5th wrong try: 30 s, doubling, at most 1 hour; timed on the wall clock and the monotonic clock, so moving the date forward does not shorten it until the phone restarts).</w:t>
@@ -970,16 +1117,18 @@
         </w:tc>
         <w:tc>
           <w:tcPr>
-            <w:tcW w:type="dxa" w:w="2160"/>
+            <w:tcW w:type="dxa" w:w="2436"/>
           </w:tcPr>
           <w:p>
             <w:r>
               <w:rPr>
+                <w:rFonts w:ascii="Open Sans" w:hAnsi="Open Sans"/>
                 <w:sz w:val="17"/>
               </w:rPr>
             </w:r>
             <w:r>
               <w:rPr>
+                <w:rFonts w:ascii="Open Sans" w:hAnsi="Open Sans"/>
                 <w:sz w:val="17"/>
               </w:rPr>
               <w:t>Test on devices from two makers. Check what remains. Judge a 4-digit PIN against someone with root, who can reset the counter. Judge the loss of the phone key (the app then says it cannot read the PIN).</w:t>
@@ -988,16 +1137,18 @@
         </w:tc>
         <w:tc>
           <w:tcPr>
-            <w:tcW w:type="dxa" w:w="2160"/>
+            <w:tcW w:type="dxa" w:w="2436"/>
           </w:tcPr>
           <w:p>
             <w:r>
               <w:rPr>
+                <w:rFonts w:ascii="Open Sans" w:hAnsi="Open Sans"/>
                 <w:sz w:val="17"/>
               </w:rPr>
             </w:r>
             <w:r>
               <w:rPr>
+                <w:rFonts w:ascii="Open Sans" w:hAnsi="Open Sans"/>
                 <w:sz w:val="17"/>
               </w:rPr>
               <w:t>D3, D3a; unit tests for the schedule</w:t>
@@ -1008,16 +1159,20 @@
       <w:tr>
         <w:tc>
           <w:tcPr>
-            <w:tcW w:type="dxa" w:w="2160"/>
+            <w:tcW w:type="dxa" w:w="2436"/>
           </w:tcPr>
           <w:p>
             <w:r>
               <w:rPr>
+                <w:rFonts w:ascii="DejaVu Sans Mono" w:hAnsi="DejaVu Sans Mono"/>
+                <w:color w:val="307098"/>
                 <w:sz w:val="17"/>
               </w:rPr>
             </w:r>
             <w:r>
               <w:rPr>
+                <w:rFonts w:ascii="DejaVu Sans Mono" w:hAnsi="DejaVu Sans Mono"/>
+                <w:color w:val="307098"/>
                 <w:sz w:val="17"/>
               </w:rPr>
               <w:t>A7</w:t>
@@ -1026,16 +1181,18 @@
         </w:tc>
         <w:tc>
           <w:tcPr>
-            <w:tcW w:type="dxa" w:w="2160"/>
+            <w:tcW w:type="dxa" w:w="2436"/>
           </w:tcPr>
           <w:p>
             <w:r>
               <w:rPr>
+                <w:rFonts w:ascii="Open Sans" w:hAnsi="Open Sans"/>
                 <w:sz w:val="17"/>
               </w:rPr>
             </w:r>
             <w:r>
               <w:rPr>
+                <w:rFonts w:ascii="Open Sans" w:hAnsi="Open Sans"/>
                 <w:sz w:val="17"/>
               </w:rPr>
               <w:t>Screenshot, screen recording and the app switcher show nothing, including dialogs. Notifications say only that a message arrived. Clipboard copies of codes are marked sensitive and cleared after 60 s (also when the app is in the background since 25 October; before, Android 10+ prevented the check and the code stayed).</w:t>
@@ -1044,16 +1201,18 @@
         </w:tc>
         <w:tc>
           <w:tcPr>
-            <w:tcW w:type="dxa" w:w="2160"/>
+            <w:tcW w:type="dxa" w:w="2436"/>
           </w:tcPr>
           <w:p>
             <w:r>
               <w:rPr>
+                <w:rFonts w:ascii="Open Sans" w:hAnsi="Open Sans"/>
                 <w:sz w:val="17"/>
               </w:rPr>
             </w:r>
             <w:r>
               <w:rPr>
+                <w:rFonts w:ascii="Open Sans" w:hAnsi="Open Sans"/>
                 <w:sz w:val="17"/>
               </w:rPr>
               <w:t>Test on devices from two makers and on Android 12 and 13 or later.</w:t>
@@ -1062,16 +1221,18 @@
         </w:tc>
         <w:tc>
           <w:tcPr>
-            <w:tcW w:type="dxa" w:w="2160"/>
+            <w:tcW w:type="dxa" w:w="2436"/>
           </w:tcPr>
           <w:p>
             <w:r>
               <w:rPr>
+                <w:rFonts w:ascii="Open Sans" w:hAnsi="Open Sans"/>
                 <w:sz w:val="17"/>
               </w:rPr>
             </w:r>
             <w:r>
               <w:rPr>
+                <w:rFonts w:ascii="Open Sans" w:hAnsi="Open Sans"/>
                 <w:sz w:val="17"/>
               </w:rPr>
               <w:t>B10; device test open for the screen blocks, the clipboard and the date change</w:t>
@@ -1082,16 +1243,20 @@
       <w:tr>
         <w:tc>
           <w:tcPr>
-            <w:tcW w:type="dxa" w:w="2160"/>
+            <w:tcW w:type="dxa" w:w="2436"/>
           </w:tcPr>
           <w:p>
             <w:r>
               <w:rPr>
+                <w:rFonts w:ascii="DejaVu Sans Mono" w:hAnsi="DejaVu Sans Mono"/>
+                <w:color w:val="307098"/>
                 <w:sz w:val="17"/>
               </w:rPr>
             </w:r>
             <w:r>
               <w:rPr>
+                <w:rFonts w:ascii="DejaVu Sans Mono" w:hAnsi="DejaVu Sans Mono"/>
+                <w:color w:val="307098"/>
                 <w:sz w:val="17"/>
               </w:rPr>
               <w:t>A8</w:t>
@@ -1100,16 +1265,18 @@
         </w:tc>
         <w:tc>
           <w:tcPr>
-            <w:tcW w:type="dxa" w:w="2160"/>
+            <w:tcW w:type="dxa" w:w="2436"/>
           </w:tcPr>
           <w:p>
             <w:r>
               <w:rPr>
+                <w:rFonts w:ascii="Open Sans" w:hAnsi="Open Sans"/>
                 <w:sz w:val="17"/>
               </w:rPr>
             </w:r>
             <w:r>
               <w:rPr>
+                <w:rFonts w:ascii="Open Sans" w:hAnsi="Open Sans"/>
                 <w:sz w:val="17"/>
               </w:rPr>
               <w:t>The crypto is sound: Double Ratchet (X25519, HKDF, XChaCha20-Poly1305), a session start without signed identities (a reduced X3DH), the outer AES-256-GCM layer, wire format v2 (planned, not built: padding inside the authenticated part, uniform packets; see F1).</w:t>
@@ -1118,16 +1285,18 @@
         </w:tc>
         <w:tc>
           <w:tcPr>
-            <w:tcW w:type="dxa" w:w="2160"/>
+            <w:tcW w:type="dxa" w:w="2436"/>
           </w:tcPr>
           <w:p>
             <w:r>
               <w:rPr>
+                <w:rFonts w:ascii="Open Sans" w:hAnsi="Open Sans"/>
                 <w:sz w:val="17"/>
               </w:rPr>
             </w:r>
             <w:r>
               <w:rPr>
+                <w:rFonts w:ascii="Open Sans" w:hAnsi="Open Sans"/>
                 <w:sz w:val="17"/>
               </w:rPr>
               <w:t>Review the protocol and the code. Decide whether the reduced session start is acceptable for the threat model. Check IV handling, key separation, error handling and replay. Note: control signals (delete contact, node migration, temp node) are protected only by the static outer layer from the pairing code, not by the ratchet (pre-audit M6, open).</w:t>
@@ -1136,16 +1305,18 @@
         </w:tc>
         <w:tc>
           <w:tcPr>
-            <w:tcW w:type="dxa" w:w="2160"/>
+            <w:tcW w:type="dxa" w:w="2436"/>
           </w:tcPr>
           <w:p>
             <w:r>
               <w:rPr>
+                <w:rFonts w:ascii="Open Sans" w:hAnsi="Open Sans"/>
                 <w:sz w:val="17"/>
               </w:rPr>
             </w:r>
             <w:r>
               <w:rPr>
+                <w:rFonts w:ascii="Open Sans" w:hAnsi="Open Sans"/>
                 <w:sz w:val="17"/>
               </w:rPr>
               <w:t>C1 to C6; cross-checks between Kotlin and TypeScript</w:t>
@@ -1156,16 +1327,20 @@
       <w:tr>
         <w:tc>
           <w:tcPr>
-            <w:tcW w:type="dxa" w:w="2160"/>
+            <w:tcW w:type="dxa" w:w="2436"/>
           </w:tcPr>
           <w:p>
             <w:r>
               <w:rPr>
+                <w:rFonts w:ascii="DejaVu Sans Mono" w:hAnsi="DejaVu Sans Mono"/>
+                <w:color w:val="307098"/>
                 <w:sz w:val="17"/>
               </w:rPr>
             </w:r>
             <w:r>
               <w:rPr>
+                <w:rFonts w:ascii="DejaVu Sans Mono" w:hAnsi="DejaVu Sans Mono"/>
+                <w:color w:val="307098"/>
                 <w:sz w:val="17"/>
               </w:rPr>
               <w:t>A9</w:t>
@@ -1174,16 +1349,18 @@
         </w:tc>
         <w:tc>
           <w:tcPr>
-            <w:tcW w:type="dxa" w:w="2160"/>
+            <w:tcW w:type="dxa" w:w="2436"/>
           </w:tcPr>
           <w:p>
             <w:r>
               <w:rPr>
+                <w:rFonts w:ascii="Open Sans" w:hAnsi="Open Sans"/>
                 <w:sz w:val="17"/>
               </w:rPr>
             </w:r>
             <w:r>
               <w:rPr>
+                <w:rFonts w:ascii="Open Sans" w:hAnsi="Open Sans"/>
                 <w:sz w:val="17"/>
               </w:rPr>
               <w:t>Input from outside is handled safely: pairing codes, node-list files, feed content, group codes, images, attachments, malformed packets.</w:t>
@@ -1192,16 +1369,18 @@
         </w:tc>
         <w:tc>
           <w:tcPr>
-            <w:tcW w:type="dxa" w:w="2160"/>
+            <w:tcW w:type="dxa" w:w="2436"/>
           </w:tcPr>
           <w:p>
             <w:r>
               <w:rPr>
+                <w:rFonts w:ascii="Open Sans" w:hAnsi="Open Sans"/>
                 <w:sz w:val="17"/>
               </w:rPr>
             </w:r>
             <w:r>
               <w:rPr>
+                <w:rFonts w:ascii="Open Sans" w:hAnsi="Open Sans"/>
                 <w:sz w:val="17"/>
               </w:rPr>
               <w:t>Fuzz these inputs. Test oversized and malformed images (a decoder guard exists since 19 October 2026). Review the node-list parser and the confirmation dialog. Since 25 October: chunk count, packet header fields, reply head lines and node-list size are bounded.</w:t>
@@ -1210,16 +1389,18 @@
         </w:tc>
         <w:tc>
           <w:tcPr>
-            <w:tcW w:type="dxa" w:w="2160"/>
+            <w:tcW w:type="dxa" w:w="2436"/>
           </w:tcPr>
           <w:p>
             <w:r>
               <w:rPr>
+                <w:rFonts w:ascii="Open Sans" w:hAnsi="Open Sans"/>
                 <w:sz w:val="17"/>
               </w:rPr>
             </w:r>
             <w:r>
               <w:rPr>
+                <w:rFonts w:ascii="Open Sans" w:hAnsi="Open Sans"/>
                 <w:sz w:val="17"/>
               </w:rPr>
               <w:t>Parser limits and tests (chunk limit, header check, list size and speed)</w:t>
@@ -1230,16 +1411,20 @@
       <w:tr>
         <w:tc>
           <w:tcPr>
-            <w:tcW w:type="dxa" w:w="2160"/>
+            <w:tcW w:type="dxa" w:w="2436"/>
           </w:tcPr>
           <w:p>
             <w:r>
               <w:rPr>
+                <w:rFonts w:ascii="DejaVu Sans Mono" w:hAnsi="DejaVu Sans Mono"/>
+                <w:color w:val="307098"/>
                 <w:sz w:val="17"/>
               </w:rPr>
             </w:r>
             <w:r>
               <w:rPr>
+                <w:rFonts w:ascii="DejaVu Sans Mono" w:hAnsi="DejaVu Sans Mono"/>
+                <w:color w:val="307098"/>
                 <w:sz w:val="17"/>
               </w:rPr>
               <w:t>A10</w:t>
@@ -1248,16 +1433,18 @@
         </w:tc>
         <w:tc>
           <w:tcPr>
-            <w:tcW w:type="dxa" w:w="2160"/>
+            <w:tcW w:type="dxa" w:w="2436"/>
           </w:tcPr>
           <w:p>
             <w:r>
               <w:rPr>
+                <w:rFonts w:ascii="Open Sans" w:hAnsi="Open Sans"/>
                 <w:sz w:val="17"/>
               </w:rPr>
             </w:r>
             <w:r>
               <w:rPr>
+                <w:rFonts w:ascii="Open Sans" w:hAnsi="Open Sans"/>
                 <w:sz w:val="17"/>
               </w:rPr>
               <w:t>Licence and device check run offline and send nothing. A root check and a build expiry exist in release builds.</w:t>
@@ -1266,42 +1453,50 @@
         </w:tc>
         <w:tc>
           <w:tcPr>
-            <w:tcW w:type="dxa" w:w="2160"/>
+            <w:tcW w:type="dxa" w:w="2436"/>
           </w:tcPr>
           <w:p>
             <w:r>
               <w:rPr>
+                <w:rFonts w:ascii="Open Sans" w:hAnsi="Open Sans"/>
                 <w:sz w:val="17"/>
               </w:rPr>
             </w:r>
             <w:r>
               <w:rPr>
+                <w:rFonts w:ascii="Open Sans" w:hAnsi="Open Sans"/>
                 <w:sz w:val="17"/>
               </w:rPr>
               <w:t xml:space="preserve">Review </w:t>
             </w:r>
             <w:r>
               <w:rPr>
-                <w:rFonts w:ascii="Consolas" w:hAnsi="Consolas"/>
+                <w:rFonts w:ascii="DejaVu Sans Mono" w:hAnsi="DejaVu Sans Mono"/>
+                <w:color w:val="0F2A3A"/>
                 <w:sz w:val="17"/>
+                <w:shd w:val="clear" w:color="auto" w:fill="F2F6F9"/>
               </w:rPr>
               <w:t>LicenseManager</w:t>
             </w:r>
             <w:r>
               <w:rPr>
+                <w:rFonts w:ascii="Open Sans" w:hAnsi="Open Sans"/>
                 <w:sz w:val="17"/>
               </w:rPr>
               <w:t xml:space="preserve">, </w:t>
             </w:r>
             <w:r>
               <w:rPr>
-                <w:rFonts w:ascii="Consolas" w:hAnsi="Consolas"/>
+                <w:rFonts w:ascii="DejaVu Sans Mono" w:hAnsi="DejaVu Sans Mono"/>
+                <w:color w:val="0F2A3A"/>
                 <w:sz w:val="17"/>
+                <w:shd w:val="clear" w:color="auto" w:fill="F2F6F9"/>
               </w:rPr>
               <w:t>RootDetector</w:t>
             </w:r>
             <w:r>
               <w:rPr>
+                <w:rFonts w:ascii="Open Sans" w:hAnsi="Open Sans"/>
                 <w:sz w:val="17"/>
               </w:rPr>
               <w:t xml:space="preserve"> and the expiry gate. State how far they hold against a modified app (we call them honest friction, not protection).</w:t>
@@ -1310,16 +1505,18 @@
         </w:tc>
         <w:tc>
           <w:tcPr>
-            <w:tcW w:type="dxa" w:w="2160"/>
+            <w:tcW w:type="dxa" w:w="2436"/>
           </w:tcPr>
           <w:p>
             <w:r>
               <w:rPr>
+                <w:rFonts w:ascii="Open Sans" w:hAnsi="Open Sans"/>
                 <w:sz w:val="17"/>
               </w:rPr>
             </w:r>
             <w:r>
               <w:rPr>
+                <w:rFonts w:ascii="Open Sans" w:hAnsi="Open Sans"/>
                 <w:sz w:val="17"/>
               </w:rPr>
               <w:t>B8, F2</w:t>
@@ -1330,16 +1527,20 @@
       <w:tr>
         <w:tc>
           <w:tcPr>
-            <w:tcW w:type="dxa" w:w="2160"/>
+            <w:tcW w:type="dxa" w:w="2436"/>
           </w:tcPr>
           <w:p>
             <w:r>
               <w:rPr>
+                <w:rFonts w:ascii="DejaVu Sans Mono" w:hAnsi="DejaVu Sans Mono"/>
+                <w:color w:val="307098"/>
                 <w:sz w:val="17"/>
               </w:rPr>
             </w:r>
             <w:r>
               <w:rPr>
+                <w:rFonts w:ascii="DejaVu Sans Mono" w:hAnsi="DejaVu Sans Mono"/>
+                <w:color w:val="307098"/>
                 <w:sz w:val="17"/>
               </w:rPr>
               <w:t>A11</w:t>
@@ -1348,16 +1549,18 @@
         </w:tc>
         <w:tc>
           <w:tcPr>
-            <w:tcW w:type="dxa" w:w="2160"/>
+            <w:tcW w:type="dxa" w:w="2436"/>
           </w:tcPr>
           <w:p>
             <w:r>
               <w:rPr>
+                <w:rFonts w:ascii="Open Sans" w:hAnsi="Open Sans"/>
                 <w:sz w:val="17"/>
               </w:rPr>
             </w:r>
             <w:r>
               <w:rPr>
+                <w:rFonts w:ascii="Open Sans" w:hAnsi="Open Sans"/>
                 <w:sz w:val="17"/>
               </w:rPr>
               <w:t>The delivered app equals the reviewed source.</w:t>
@@ -1366,16 +1569,18 @@
         </w:tc>
         <w:tc>
           <w:tcPr>
-            <w:tcW w:type="dxa" w:w="2160"/>
+            <w:tcW w:type="dxa" w:w="2436"/>
           </w:tcPr>
           <w:p>
             <w:r>
               <w:rPr>
+                <w:rFonts w:ascii="Open Sans" w:hAnsi="Open Sans"/>
                 <w:sz w:val="17"/>
               </w:rPr>
             </w:r>
             <w:r>
               <w:rPr>
+                <w:rFonts w:ascii="Open Sans" w:hAnsi="Open Sans"/>
                 <w:sz w:val="17"/>
               </w:rPr>
               <w:t>Rebuild from the tag, compare the result, check the signature and the R8 mapping.</w:t>
@@ -1384,16 +1589,18 @@
         </w:tc>
         <w:tc>
           <w:tcPr>
-            <w:tcW w:type="dxa" w:w="2160"/>
+            <w:tcW w:type="dxa" w:w="2436"/>
           </w:tcPr>
           <w:p>
             <w:r>
               <w:rPr>
+                <w:rFonts w:ascii="Open Sans" w:hAnsi="Open Sans"/>
                 <w:sz w:val="17"/>
               </w:rPr>
             </w:r>
             <w:r>
               <w:rPr>
+                <w:rFonts w:ascii="Open Sans" w:hAnsi="Open Sans"/>
                 <w:sz w:val="17"/>
               </w:rPr>
               <w:t>Release key in place; no reproducible build yet</w:t>
@@ -1404,16 +1611,20 @@
       <w:tr>
         <w:tc>
           <w:tcPr>
-            <w:tcW w:type="dxa" w:w="2160"/>
+            <w:tcW w:type="dxa" w:w="2436"/>
           </w:tcPr>
           <w:p>
             <w:r>
               <w:rPr>
+                <w:rFonts w:ascii="DejaVu Sans Mono" w:hAnsi="DejaVu Sans Mono"/>
+                <w:color w:val="307098"/>
                 <w:sz w:val="17"/>
               </w:rPr>
             </w:r>
             <w:r>
               <w:rPr>
+                <w:rFonts w:ascii="DejaVu Sans Mono" w:hAnsi="DejaVu Sans Mono"/>
+                <w:color w:val="307098"/>
                 <w:sz w:val="17"/>
               </w:rPr>
               <w:t>A12</w:t>
@@ -1422,16 +1633,18 @@
         </w:tc>
         <w:tc>
           <w:tcPr>
-            <w:tcW w:type="dxa" w:w="2160"/>
+            <w:tcW w:type="dxa" w:w="2436"/>
           </w:tcPr>
           <w:p>
             <w:r>
               <w:rPr>
+                <w:rFonts w:ascii="Open Sans" w:hAnsi="Open Sans"/>
                 <w:sz w:val="17"/>
               </w:rPr>
             </w:r>
             <w:r>
               <w:rPr>
+                <w:rFonts w:ascii="Open Sans" w:hAnsi="Open Sans"/>
                 <w:sz w:val="17"/>
               </w:rPr>
               <w:t>The Tor and bridge integration works as described and fails safely.</w:t>
@@ -1440,29 +1653,34 @@
         </w:tc>
         <w:tc>
           <w:tcPr>
-            <w:tcW w:type="dxa" w:w="2160"/>
+            <w:tcW w:type="dxa" w:w="2436"/>
           </w:tcPr>
           <w:p>
             <w:r>
               <w:rPr>
+                <w:rFonts w:ascii="Open Sans" w:hAnsi="Open Sans"/>
                 <w:sz w:val="17"/>
               </w:rPr>
             </w:r>
             <w:r>
               <w:rPr>
+                <w:rFonts w:ascii="Open Sans" w:hAnsi="Open Sans"/>
                 <w:sz w:val="17"/>
               </w:rPr>
               <w:t xml:space="preserve">Review </w:t>
             </w:r>
             <w:r>
               <w:rPr>
-                <w:rFonts w:ascii="Consolas" w:hAnsi="Consolas"/>
+                <w:rFonts w:ascii="DejaVu Sans Mono" w:hAnsi="DejaVu Sans Mono"/>
+                <w:color w:val="0F2A3A"/>
                 <w:sz w:val="17"/>
+                <w:shd w:val="clear" w:color="auto" w:fill="F2F6F9"/>
               </w:rPr>
               <w:t>TorManager</w:t>
             </w:r>
             <w:r>
               <w:rPr>
+                <w:rFonts w:ascii="Open Sans" w:hAnsi="Open Sans"/>
                 <w:sz w:val="17"/>
               </w:rPr>
               <w:t>, the bridge manager and the pluggable transports: start, circuit use, behaviour when Tor is blocked, what leaks when it fails.</w:t>
@@ -1471,16 +1689,18 @@
         </w:tc>
         <w:tc>
           <w:tcPr>
-            <w:tcW w:type="dxa" w:w="2160"/>
+            <w:tcW w:type="dxa" w:w="2436"/>
           </w:tcPr>
           <w:p>
             <w:r>
               <w:rPr>
+                <w:rFonts w:ascii="Open Sans" w:hAnsi="Open Sans"/>
                 <w:sz w:val="17"/>
               </w:rPr>
             </w:r>
             <w:r>
               <w:rPr>
+                <w:rFonts w:ascii="Open Sans" w:hAnsi="Open Sans"/>
                 <w:sz w:val="17"/>
               </w:rPr>
               <w:t>Not yet reviewed by us beyond B7</w:t>
@@ -1493,8 +1713,15 @@
     <w:p>
       <w:pPr>
         <w:pStyle w:val="Heading2"/>
+        <w:pBdr>
+          <w:bottom w:val="single" w:sz="6" w:space="4" w:color="D9E4EA"/>
+        </w:pBdr>
       </w:pPr>
       <w:r>
+        <w:rPr>
+          <w:rFonts w:ascii="Open Sans" w:hAnsi="Open Sans"/>
+          <w:color w:val="0F2A3A"/>
+        </w:rPr>
         <w:t>5. How we would like the work done</w:t>
       </w:r>
     </w:p>
@@ -1538,8 +1765,15 @@
     <w:p>
       <w:pPr>
         <w:pStyle w:val="Heading2"/>
+        <w:pBdr>
+          <w:bottom w:val="single" w:sz="6" w:space="4" w:color="D9E4EA"/>
+        </w:pBdr>
       </w:pPr>
       <w:r>
+        <w:rPr>
+          <w:rFonts w:ascii="Open Sans" w:hAnsi="Open Sans"/>
+          <w:color w:val="0F2A3A"/>
+        </w:rPr>
         <w:t>6. Limits we state ourselves</w:t>
       </w:r>
     </w:p>
@@ -1642,8 +1876,15 @@
     <w:p>
       <w:pPr>
         <w:pStyle w:val="Heading2"/>
+        <w:pBdr>
+          <w:bottom w:val="single" w:sz="6" w:space="4" w:color="D9E4EA"/>
+        </w:pBdr>
       </w:pPr>
       <w:r>
+        <w:rPr>
+          <w:rFonts w:ascii="Open Sans" w:hAnsi="Open Sans"/>
+          <w:color w:val="0F2A3A"/>
+        </w:rPr>
         <w:t>7. Out of scope</w:t>
       </w:r>
     </w:p>
@@ -1653,8 +1894,10 @@
       </w:r>
       <w:r>
         <w:rPr>
-          <w:rFonts w:ascii="Consolas" w:hAnsi="Consolas"/>
-          <w:sz w:val="18"/>
+          <w:rFonts w:ascii="DejaVu Sans Mono" w:hAnsi="DejaVu Sans Mono"/>
+          <w:color w:val="0F2A3A"/>
+          <w:sz w:val="17"/>
+          <w:shd w:val="clear" w:color="auto" w:fill="F2F6F9"/>
         </w:rPr>
         <w:t>whistleblower</w:t>
       </w:r>
@@ -1663,8 +1906,10 @@
       </w:r>
       <w:r>
         <w:rPr>
-          <w:rFonts w:ascii="Consolas" w:hAnsi="Consolas"/>
-          <w:sz w:val="18"/>
+          <w:rFonts w:ascii="DejaVu Sans Mono" w:hAnsi="DejaVu Sans Mono"/>
+          <w:color w:val="0F2A3A"/>
+          <w:sz w:val="17"/>
+          <w:shd w:val="clear" w:color="auto" w:fill="F2F6F9"/>
         </w:rPr>
         <w:t>press</w:t>
       </w:r>
@@ -1675,8 +1920,15 @@
     <w:p>
       <w:pPr>
         <w:pStyle w:val="Heading2"/>
+        <w:pBdr>
+          <w:bottom w:val="single" w:sz="6" w:space="4" w:color="D9E4EA"/>
+        </w:pBdr>
       </w:pPr>
       <w:r>
+        <w:rPr>
+          <w:rFonts w:ascii="Open Sans" w:hAnsi="Open Sans"/>
+          <w:color w:val="0F2A3A"/>
+        </w:rPr>
         <w:t>8. Deliverables</w:t>
       </w:r>
     </w:p>
@@ -1728,8 +1980,15 @@
     <w:p>
       <w:pPr>
         <w:pStyle w:val="Heading2"/>
+        <w:pBdr>
+          <w:bottom w:val="single" w:sz="6" w:space="4" w:color="D9E4EA"/>
+        </w:pBdr>
       </w:pPr>
       <w:r>
+        <w:rPr>
+          <w:rFonts w:ascii="Open Sans" w:hAnsi="Open Sans"/>
+          <w:color w:val="0F2A3A"/>
+        </w:rPr>
         <w:t>9. What our own pre-audit found (25 October 2026)</w:t>
       </w:r>
     </w:p>
@@ -1740,30 +1999,36 @@
     </w:p>
     <w:tbl>
       <w:tblPr>
-        <w:tblStyle w:val="TableGrid"/>
         <w:tblW w:type="auto" w:w="0"/>
         <w:tblLook w:firstColumn="1" w:firstRow="1" w:lastColumn="0" w:lastRow="0" w:noHBand="0" w:noVBand="1" w:val="04A0"/>
+        <w:tblBorders>
+          <w:top w:val="single" w:sz="6" w:space="0" w:color="D9E4EA"/>
+          <w:bottom w:val="single" w:sz="6" w:space="0" w:color="D9E4EA"/>
+          <w:insideH w:val="single" w:sz="6" w:space="0" w:color="D9E4EA"/>
+        </w:tblBorders>
       </w:tblPr>
       <w:tblGrid>
-        <w:gridCol w:w="2880"/>
-        <w:gridCol w:w="2880"/>
-        <w:gridCol w:w="2880"/>
+        <w:gridCol w:w="3249"/>
+        <w:gridCol w:w="3249"/>
+        <w:gridCol w:w="3249"/>
       </w:tblGrid>
       <w:tr>
         <w:tc>
           <w:tcPr>
-            <w:tcW w:type="dxa" w:w="2880"/>
-            <w:shd w:val="clear" w:color="auto" w:fill="E7ECEF"/>
+            <w:tcW w:type="dxa" w:w="3249"/>
+            <w:shd w:val="clear" w:color="auto" w:fill="F2F6F9"/>
           </w:tcPr>
           <w:p>
             <w:r>
               <w:rPr>
+                <w:rFonts w:ascii="Open Sans" w:hAnsi="Open Sans"/>
                 <w:b/>
                 <w:sz w:val="17"/>
               </w:rPr>
             </w:r>
             <w:r>
               <w:rPr>
+                <w:rFonts w:ascii="Open Sans" w:hAnsi="Open Sans"/>
                 <w:b/>
                 <w:sz w:val="17"/>
               </w:rPr>
@@ -1773,18 +2038,20 @@
         </w:tc>
         <w:tc>
           <w:tcPr>
-            <w:tcW w:type="dxa" w:w="2880"/>
-            <w:shd w:val="clear" w:color="auto" w:fill="E7ECEF"/>
+            <w:tcW w:type="dxa" w:w="3249"/>
+            <w:shd w:val="clear" w:color="auto" w:fill="F2F6F9"/>
           </w:tcPr>
           <w:p>
             <w:r>
               <w:rPr>
+                <w:rFonts w:ascii="Open Sans" w:hAnsi="Open Sans"/>
                 <w:b/>
                 <w:sz w:val="17"/>
               </w:rPr>
             </w:r>
             <w:r>
               <w:rPr>
+                <w:rFonts w:ascii="Open Sans" w:hAnsi="Open Sans"/>
                 <w:b/>
                 <w:sz w:val="17"/>
               </w:rPr>
@@ -1794,18 +2061,20 @@
         </w:tc>
         <w:tc>
           <w:tcPr>
-            <w:tcW w:type="dxa" w:w="2880"/>
-            <w:shd w:val="clear" w:color="auto" w:fill="E7ECEF"/>
+            <w:tcW w:type="dxa" w:w="3249"/>
+            <w:shd w:val="clear" w:color="auto" w:fill="F2F6F9"/>
           </w:tcPr>
           <w:p>
             <w:r>
               <w:rPr>
+                <w:rFonts w:ascii="Open Sans" w:hAnsi="Open Sans"/>
                 <w:b/>
                 <w:sz w:val="17"/>
               </w:rPr>
             </w:r>
             <w:r>
               <w:rPr>
+                <w:rFonts w:ascii="Open Sans" w:hAnsi="Open Sans"/>
                 <w:b/>
                 <w:sz w:val="17"/>
               </w:rPr>
@@ -1817,16 +2086,20 @@
       <w:tr>
         <w:tc>
           <w:tcPr>
-            <w:tcW w:type="dxa" w:w="2880"/>
+            <w:tcW w:type="dxa" w:w="3249"/>
           </w:tcPr>
           <w:p>
             <w:r>
               <w:rPr>
+                <w:rFonts w:ascii="DejaVu Sans Mono" w:hAnsi="DejaVu Sans Mono"/>
+                <w:color w:val="307098"/>
                 <w:sz w:val="17"/>
               </w:rPr>
             </w:r>
             <w:r>
               <w:rPr>
+                <w:rFonts w:ascii="DejaVu Sans Mono" w:hAnsi="DejaVu Sans Mono"/>
+                <w:color w:val="307098"/>
                 <w:sz w:val="17"/>
               </w:rPr>
               <w:t>F1, L12</w:t>
@@ -1835,16 +2108,18 @@
         </w:tc>
         <w:tc>
           <w:tcPr>
-            <w:tcW w:type="dxa" w:w="2880"/>
+            <w:tcW w:type="dxa" w:w="3249"/>
           </w:tcPr>
           <w:p>
             <w:r>
               <w:rPr>
+                <w:rFonts w:ascii="Open Sans" w:hAnsi="Open Sans"/>
                 <w:sz w:val="17"/>
               </w:rPr>
             </w:r>
             <w:r>
               <w:rPr>
+                <w:rFonts w:ascii="Open Sans" w:hAnsi="Open Sans"/>
                 <w:sz w:val="17"/>
               </w:rPr>
               <w:t>Payload length readable in the stored packet; padding is zeros behind the message</w:t>
@@ -1853,16 +2128,18 @@
         </w:tc>
         <w:tc>
           <w:tcPr>
-            <w:tcW w:type="dxa" w:w="2880"/>
+            <w:tcW w:type="dxa" w:w="3249"/>
           </w:tcPr>
           <w:p>
             <w:r>
               <w:rPr>
+                <w:rFonts w:ascii="Open Sans" w:hAnsi="Open Sans"/>
                 <w:sz w:val="17"/>
               </w:rPr>
             </w:r>
             <w:r>
               <w:rPr>
+                <w:rFonts w:ascii="Open Sans" w:hAnsi="Open Sans"/>
                 <w:b/>
                 <w:sz w:val="17"/>
               </w:rPr>
@@ -1870,6 +2147,7 @@
             </w:r>
             <w:r>
               <w:rPr>
+                <w:rFonts w:ascii="Open Sans" w:hAnsi="Open Sans"/>
                 <w:sz w:val="17"/>
               </w:rPr>
               <w:t>, decision pending (wire format v2)</w:t>
@@ -1880,16 +2158,20 @@
       <w:tr>
         <w:tc>
           <w:tcPr>
-            <w:tcW w:type="dxa" w:w="2880"/>
+            <w:tcW w:type="dxa" w:w="3249"/>
           </w:tcPr>
           <w:p>
             <w:r>
               <w:rPr>
+                <w:rFonts w:ascii="DejaVu Sans Mono" w:hAnsi="DejaVu Sans Mono"/>
+                <w:color w:val="307098"/>
                 <w:sz w:val="17"/>
               </w:rPr>
             </w:r>
             <w:r>
               <w:rPr>
+                <w:rFonts w:ascii="DejaVu Sans Mono" w:hAnsi="DejaVu Sans Mono"/>
+                <w:color w:val="307098"/>
                 <w:sz w:val="17"/>
               </w:rPr>
               <w:t>H1</w:t>
@@ -1898,16 +2180,18 @@
         </w:tc>
         <w:tc>
           <w:tcPr>
-            <w:tcW w:type="dxa" w:w="2880"/>
+            <w:tcW w:type="dxa" w:w="3249"/>
           </w:tcPr>
           <w:p>
             <w:r>
               <w:rPr>
+                <w:rFonts w:ascii="Open Sans" w:hAnsi="Open Sans"/>
                 <w:sz w:val="17"/>
               </w:rPr>
             </w:r>
             <w:r>
               <w:rPr>
+                <w:rFonts w:ascii="Open Sans" w:hAnsi="Open Sans"/>
                 <w:sz w:val="17"/>
               </w:rPr>
               <w:t>Key of the contact database in clear in the app settings</w:t>
@@ -1916,16 +2200,18 @@
         </w:tc>
         <w:tc>
           <w:tcPr>
-            <w:tcW w:type="dxa" w:w="2880"/>
+            <w:tcW w:type="dxa" w:w="3249"/>
           </w:tcPr>
           <w:p>
             <w:r>
               <w:rPr>
+                <w:rFonts w:ascii="Open Sans" w:hAnsi="Open Sans"/>
                 <w:sz w:val="17"/>
               </w:rPr>
             </w:r>
             <w:r>
               <w:rPr>
+                <w:rFonts w:ascii="Open Sans" w:hAnsi="Open Sans"/>
                 <w:sz w:val="17"/>
               </w:rPr>
               <w:t>Fixed (sealed under the phone key, migration for older installs); device test open</w:t>
@@ -1936,16 +2222,20 @@
       <w:tr>
         <w:tc>
           <w:tcPr>
-            <w:tcW w:type="dxa" w:w="2880"/>
+            <w:tcW w:type="dxa" w:w="3249"/>
           </w:tcPr>
           <w:p>
             <w:r>
               <w:rPr>
+                <w:rFonts w:ascii="DejaVu Sans Mono" w:hAnsi="DejaVu Sans Mono"/>
+                <w:color w:val="307098"/>
                 <w:sz w:val="17"/>
               </w:rPr>
             </w:r>
             <w:r>
               <w:rPr>
+                <w:rFonts w:ascii="DejaVu Sans Mono" w:hAnsi="DejaVu Sans Mono"/>
+                <w:color w:val="307098"/>
                 <w:sz w:val="17"/>
               </w:rPr>
               <w:t>M9</w:t>
@@ -1954,16 +2244,18 @@
         </w:tc>
         <w:tc>
           <w:tcPr>
-            <w:tcW w:type="dxa" w:w="2880"/>
+            <w:tcW w:type="dxa" w:w="3249"/>
           </w:tcPr>
           <w:p>
             <w:r>
               <w:rPr>
+                <w:rFonts w:ascii="Open Sans" w:hAnsi="Open Sans"/>
                 <w:sz w:val="17"/>
               </w:rPr>
             </w:r>
             <w:r>
               <w:rPr>
+                <w:rFonts w:ascii="Open Sans" w:hAnsi="Open Sans"/>
                 <w:sz w:val="17"/>
               </w:rPr>
               <w:t>Device-to-device transfer not excluded</w:t>
@@ -1972,29 +2264,34 @@
         </w:tc>
         <w:tc>
           <w:tcPr>
-            <w:tcW w:type="dxa" w:w="2880"/>
+            <w:tcW w:type="dxa" w:w="3249"/>
           </w:tcPr>
           <w:p>
             <w:r>
               <w:rPr>
+                <w:rFonts w:ascii="Open Sans" w:hAnsi="Open Sans"/>
                 <w:sz w:val="17"/>
               </w:rPr>
             </w:r>
             <w:r>
               <w:rPr>
+                <w:rFonts w:ascii="Open Sans" w:hAnsi="Open Sans"/>
                 <w:sz w:val="17"/>
               </w:rPr>
               <w:t>Fixed (</w:t>
             </w:r>
             <w:r>
               <w:rPr>
-                <w:rFonts w:ascii="Consolas" w:hAnsi="Consolas"/>
+                <w:rFonts w:ascii="DejaVu Sans Mono" w:hAnsi="DejaVu Sans Mono"/>
+                <w:color w:val="0F2A3A"/>
                 <w:sz w:val="17"/>
+                <w:shd w:val="clear" w:color="auto" w:fill="F2F6F9"/>
               </w:rPr>
               <w:t>dataExtractionRules</w:t>
             </w:r>
             <w:r>
               <w:rPr>
+                <w:rFonts w:ascii="Open Sans" w:hAnsi="Open Sans"/>
                 <w:sz w:val="17"/>
               </w:rPr>
               <w:t>); device test with a maker tool open</w:t>
@@ -2005,16 +2302,20 @@
       <w:tr>
         <w:tc>
           <w:tcPr>
-            <w:tcW w:type="dxa" w:w="2880"/>
+            <w:tcW w:type="dxa" w:w="3249"/>
           </w:tcPr>
           <w:p>
             <w:r>
               <w:rPr>
+                <w:rFonts w:ascii="DejaVu Sans Mono" w:hAnsi="DejaVu Sans Mono"/>
+                <w:color w:val="307098"/>
                 <w:sz w:val="17"/>
               </w:rPr>
             </w:r>
             <w:r>
               <w:rPr>
+                <w:rFonts w:ascii="DejaVu Sans Mono" w:hAnsi="DejaVu Sans Mono"/>
+                <w:color w:val="307098"/>
                 <w:sz w:val="17"/>
               </w:rPr>
               <w:t>M10</w:t>
@@ -2023,16 +2324,18 @@
         </w:tc>
         <w:tc>
           <w:tcPr>
-            <w:tcW w:type="dxa" w:w="2880"/>
+            <w:tcW w:type="dxa" w:w="3249"/>
           </w:tcPr>
           <w:p>
             <w:r>
               <w:rPr>
+                <w:rFonts w:ascii="Open Sans" w:hAnsi="Open Sans"/>
                 <w:sz w:val="17"/>
               </w:rPr>
             </w:r>
             <w:r>
               <w:rPr>
+                <w:rFonts w:ascii="Open Sans" w:hAnsi="Open Sans"/>
                 <w:sz w:val="17"/>
               </w:rPr>
               <w:t>Panic PIN left the pairing code on screen and recoverable database rows</w:t>
@@ -2041,16 +2344,18 @@
         </w:tc>
         <w:tc>
           <w:tcPr>
-            <w:tcW w:type="dxa" w:w="2880"/>
+            <w:tcW w:type="dxa" w:w="3249"/>
           </w:tcPr>
           <w:p>
             <w:r>
               <w:rPr>
+                <w:rFonts w:ascii="Open Sans" w:hAnsi="Open Sans"/>
                 <w:sz w:val="17"/>
               </w:rPr>
             </w:r>
             <w:r>
               <w:rPr>
+                <w:rFonts w:ascii="Open Sans" w:hAnsi="Open Sans"/>
                 <w:sz w:val="17"/>
               </w:rPr>
               <w:t>Fixed (wipe extended, secure delete, vacuum); device test open</w:t>
@@ -2061,16 +2366,20 @@
       <w:tr>
         <w:tc>
           <w:tcPr>
-            <w:tcW w:type="dxa" w:w="2880"/>
+            <w:tcW w:type="dxa" w:w="3249"/>
           </w:tcPr>
           <w:p>
             <w:r>
               <w:rPr>
+                <w:rFonts w:ascii="DejaVu Sans Mono" w:hAnsi="DejaVu Sans Mono"/>
+                <w:color w:val="307098"/>
                 <w:sz w:val="17"/>
               </w:rPr>
             </w:r>
             <w:r>
               <w:rPr>
+                <w:rFonts w:ascii="DejaVu Sans Mono" w:hAnsi="DejaVu Sans Mono"/>
+                <w:color w:val="307098"/>
                 <w:sz w:val="17"/>
               </w:rPr>
               <w:t>M7</w:t>
@@ -2079,16 +2388,18 @@
         </w:tc>
         <w:tc>
           <w:tcPr>
-            <w:tcW w:type="dxa" w:w="2880"/>
+            <w:tcW w:type="dxa" w:w="3249"/>
           </w:tcPr>
           <w:p>
             <w:r>
               <w:rPr>
+                <w:rFonts w:ascii="Open Sans" w:hAnsi="Open Sans"/>
                 <w:sz w:val="17"/>
               </w:rPr>
             </w:r>
             <w:r>
               <w:rPr>
+                <w:rFonts w:ascii="Open Sans" w:hAnsi="Open Sans"/>
                 <w:sz w:val="17"/>
               </w:rPr>
               <w:t>Node addresses not limited to v3 onions (write key could go to a plain host through an exit)</w:t>
@@ -2097,16 +2408,18 @@
         </w:tc>
         <w:tc>
           <w:tcPr>
-            <w:tcW w:type="dxa" w:w="2880"/>
+            <w:tcW w:type="dxa" w:w="3249"/>
           </w:tcPr>
           <w:p>
             <w:r>
               <w:rPr>
+                <w:rFonts w:ascii="Open Sans" w:hAnsi="Open Sans"/>
                 <w:sz w:val="17"/>
               </w:rPr>
             </w:r>
             <w:r>
               <w:rPr>
+                <w:rFonts w:ascii="Open Sans" w:hAnsi="Open Sans"/>
                 <w:sz w:val="17"/>
               </w:rPr>
               <w:t>Fixed in pairing codes, node lists, owner strings, migration signals and the transport</w:t>
@@ -2117,16 +2430,20 @@
       <w:tr>
         <w:tc>
           <w:tcPr>
-            <w:tcW w:type="dxa" w:w="2880"/>
+            <w:tcW w:type="dxa" w:w="3249"/>
           </w:tcPr>
           <w:p>
             <w:r>
               <w:rPr>
+                <w:rFonts w:ascii="DejaVu Sans Mono" w:hAnsi="DejaVu Sans Mono"/>
+                <w:color w:val="307098"/>
                 <w:sz w:val="17"/>
               </w:rPr>
             </w:r>
             <w:r>
               <w:rPr>
+                <w:rFonts w:ascii="DejaVu Sans Mono" w:hAnsi="DejaVu Sans Mono"/>
+                <w:color w:val="307098"/>
                 <w:sz w:val="17"/>
               </w:rPr>
               <w:t>L4</w:t>
@@ -2135,16 +2452,18 @@
         </w:tc>
         <w:tc>
           <w:tcPr>
-            <w:tcW w:type="dxa" w:w="2880"/>
+            <w:tcW w:type="dxa" w:w="3249"/>
           </w:tcPr>
           <w:p>
             <w:r>
               <w:rPr>
+                <w:rFonts w:ascii="Open Sans" w:hAnsi="Open Sans"/>
                 <w:sz w:val="17"/>
               </w:rPr>
             </w:r>
             <w:r>
               <w:rPr>
+                <w:rFonts w:ascii="Open Sans" w:hAnsi="Open Sans"/>
                 <w:sz w:val="17"/>
               </w:rPr>
               <w:t>Clipboard not cleared when the app is in the background</w:t>
@@ -2153,16 +2472,18 @@
         </w:tc>
         <w:tc>
           <w:tcPr>
-            <w:tcW w:type="dxa" w:w="2880"/>
+            <w:tcW w:type="dxa" w:w="3249"/>
           </w:tcPr>
           <w:p>
             <w:r>
               <w:rPr>
+                <w:rFonts w:ascii="Open Sans" w:hAnsi="Open Sans"/>
                 <w:sz w:val="17"/>
               </w:rPr>
             </w:r>
             <w:r>
               <w:rPr>
+                <w:rFonts w:ascii="Open Sans" w:hAnsi="Open Sans"/>
                 <w:sz w:val="17"/>
               </w:rPr>
               <w:t>Fixed; device test open</w:t>
@@ -2173,16 +2494,18 @@
       <w:tr>
         <w:tc>
           <w:tcPr>
-            <w:tcW w:type="dxa" w:w="2880"/>
+            <w:tcW w:type="dxa" w:w="3249"/>
           </w:tcPr>
           <w:p>
             <w:r>
               <w:rPr>
+                <w:rFonts w:ascii="Open Sans" w:hAnsi="Open Sans"/>
                 <w:sz w:val="17"/>
               </w:rPr>
             </w:r>
             <w:r>
               <w:rPr>
+                <w:rFonts w:ascii="Open Sans" w:hAnsi="Open Sans"/>
                 <w:sz w:val="17"/>
               </w:rPr>
               <w:t>L5, L6, L10, L11</w:t>
@@ -2191,16 +2514,18 @@
         </w:tc>
         <w:tc>
           <w:tcPr>
-            <w:tcW w:type="dxa" w:w="2880"/>
+            <w:tcW w:type="dxa" w:w="3249"/>
           </w:tcPr>
           <w:p>
             <w:r>
               <w:rPr>
+                <w:rFonts w:ascii="Open Sans" w:hAnsi="Open Sans"/>
                 <w:sz w:val="17"/>
               </w:rPr>
             </w:r>
             <w:r>
               <w:rPr>
+                <w:rFonts w:ascii="Open Sans" w:hAnsi="Open Sans"/>
                 <w:sz w:val="17"/>
               </w:rPr>
               <w:t>Unbounded chunk count and packet header, quadratic list parser, PIN pause shortened by moving the date, slow Temp Node connections</w:t>
@@ -2209,16 +2534,18 @@
         </w:tc>
         <w:tc>
           <w:tcPr>
-            <w:tcW w:type="dxa" w:w="2880"/>
+            <w:tcW w:type="dxa" w:w="3249"/>
           </w:tcPr>
           <w:p>
             <w:r>
               <w:rPr>
+                <w:rFonts w:ascii="Open Sans" w:hAnsi="Open Sans"/>
                 <w:sz w:val="17"/>
               </w:rPr>
             </w:r>
             <w:r>
               <w:rPr>
+                <w:rFonts w:ascii="Open Sans" w:hAnsi="Open Sans"/>
                 <w:sz w:val="17"/>
               </w:rPr>
               <w:t>Fixed</w:t>
@@ -2229,16 +2556,20 @@
       <w:tr>
         <w:tc>
           <w:tcPr>
-            <w:tcW w:type="dxa" w:w="2880"/>
+            <w:tcW w:type="dxa" w:w="3249"/>
           </w:tcPr>
           <w:p>
             <w:r>
               <w:rPr>
+                <w:rFonts w:ascii="DejaVu Sans Mono" w:hAnsi="DejaVu Sans Mono"/>
+                <w:color w:val="307098"/>
                 <w:sz w:val="17"/>
               </w:rPr>
             </w:r>
             <w:r>
               <w:rPr>
+                <w:rFonts w:ascii="DejaVu Sans Mono" w:hAnsi="DejaVu Sans Mono"/>
+                <w:color w:val="307098"/>
                 <w:sz w:val="17"/>
               </w:rPr>
               <w:t>M4</w:t>
@@ -2247,16 +2578,18 @@
         </w:tc>
         <w:tc>
           <w:tcPr>
-            <w:tcW w:type="dxa" w:w="2880"/>
+            <w:tcW w:type="dxa" w:w="3249"/>
           </w:tcPr>
           <w:p>
             <w:r>
               <w:rPr>
+                <w:rFonts w:ascii="Open Sans" w:hAnsi="Open Sans"/>
                 <w:sz w:val="17"/>
               </w:rPr>
             </w:r>
             <w:r>
               <w:rPr>
+                <w:rFonts w:ascii="Open Sans" w:hAnsi="Open Sans"/>
                 <w:sz w:val="17"/>
               </w:rPr>
               <w:t>A node operator can chain a contact's tags over days (26 tags per request, contacts bundled)</w:t>
@@ -2265,16 +2598,18 @@
         </w:tc>
         <w:tc>
           <w:tcPr>
-            <w:tcW w:type="dxa" w:w="2880"/>
+            <w:tcW w:type="dxa" w:w="3249"/>
           </w:tcPr>
           <w:p>
             <w:r>
               <w:rPr>
+                <w:rFonts w:ascii="Open Sans" w:hAnsi="Open Sans"/>
                 <w:sz w:val="17"/>
               </w:rPr>
             </w:r>
             <w:r>
               <w:rPr>
+                <w:rFonts w:ascii="Open Sans" w:hAnsi="Open Sans"/>
                 <w:b/>
                 <w:sz w:val="17"/>
               </w:rPr>
@@ -2282,6 +2617,7 @@
             </w:r>
             <w:r>
               <w:rPr>
+                <w:rFonts w:ascii="Open Sans" w:hAnsi="Open Sans"/>
                 <w:sz w:val="17"/>
               </w:rPr>
               <w:t xml:space="preserve"> on 25 Oct: per-contact requests on own timers, 2 to 3 epochs, own SOCKS user name per contact; overlap by one epoch remains; not verified on real Tor</w:t>
@@ -2292,16 +2628,20 @@
       <w:tr>
         <w:tc>
           <w:tcPr>
-            <w:tcW w:type="dxa" w:w="2880"/>
+            <w:tcW w:type="dxa" w:w="3249"/>
           </w:tcPr>
           <w:p>
             <w:r>
               <w:rPr>
+                <w:rFonts w:ascii="DejaVu Sans Mono" w:hAnsi="DejaVu Sans Mono"/>
+                <w:color w:val="307098"/>
                 <w:sz w:val="17"/>
               </w:rPr>
             </w:r>
             <w:r>
               <w:rPr>
+                <w:rFonts w:ascii="DejaVu Sans Mono" w:hAnsi="DejaVu Sans Mono"/>
+                <w:color w:val="307098"/>
                 <w:sz w:val="17"/>
               </w:rPr>
               <w:t>M5</w:t>
@@ -2310,16 +2650,18 @@
         </w:tc>
         <w:tc>
           <w:tcPr>
-            <w:tcW w:type="dxa" w:w="2880"/>
+            <w:tcW w:type="dxa" w:w="3249"/>
           </w:tcPr>
           <w:p>
             <w:r>
               <w:rPr>
+                <w:rFonts w:ascii="Open Sans" w:hAnsi="Open Sans"/>
                 <w:sz w:val="17"/>
               </w:rPr>
             </w:r>
             <w:r>
               <w:rPr>
+                <w:rFonts w:ascii="Open Sans" w:hAnsi="Open Sans"/>
                 <w:sz w:val="17"/>
               </w:rPr>
               <w:t>One write key per server for all company devices</w:t>
@@ -2328,16 +2670,18 @@
         </w:tc>
         <w:tc>
           <w:tcPr>
-            <w:tcW w:type="dxa" w:w="2880"/>
+            <w:tcW w:type="dxa" w:w="3249"/>
           </w:tcPr>
           <w:p>
             <w:r>
               <w:rPr>
+                <w:rFonts w:ascii="Open Sans" w:hAnsi="Open Sans"/>
                 <w:sz w:val="17"/>
               </w:rPr>
             </w:r>
             <w:r>
               <w:rPr>
+                <w:rFonts w:ascii="Open Sans" w:hAnsi="Open Sans"/>
                 <w:b/>
                 <w:sz w:val="17"/>
               </w:rPr>
@@ -2345,6 +2689,7 @@
             </w:r>
             <w:r>
               <w:rPr>
+                <w:rFonts w:ascii="Open Sans" w:hAnsi="Open Sans"/>
                 <w:sz w:val="17"/>
               </w:rPr>
               <w:t>, design question</w:t>
@@ -2355,16 +2700,20 @@
       <w:tr>
         <w:tc>
           <w:tcPr>
-            <w:tcW w:type="dxa" w:w="2880"/>
+            <w:tcW w:type="dxa" w:w="3249"/>
           </w:tcPr>
           <w:p>
             <w:r>
               <w:rPr>
+                <w:rFonts w:ascii="DejaVu Sans Mono" w:hAnsi="DejaVu Sans Mono"/>
+                <w:color w:val="307098"/>
                 <w:sz w:val="17"/>
               </w:rPr>
             </w:r>
             <w:r>
               <w:rPr>
+                <w:rFonts w:ascii="DejaVu Sans Mono" w:hAnsi="DejaVu Sans Mono"/>
+                <w:color w:val="307098"/>
                 <w:sz w:val="17"/>
               </w:rPr>
               <w:t>M6</w:t>
@@ -2373,16 +2722,18 @@
         </w:tc>
         <w:tc>
           <w:tcPr>
-            <w:tcW w:type="dxa" w:w="2880"/>
+            <w:tcW w:type="dxa" w:w="3249"/>
           </w:tcPr>
           <w:p>
             <w:r>
               <w:rPr>
+                <w:rFonts w:ascii="Open Sans" w:hAnsi="Open Sans"/>
                 <w:sz w:val="17"/>
               </w:rPr>
             </w:r>
             <w:r>
               <w:rPr>
+                <w:rFonts w:ascii="Open Sans" w:hAnsi="Open Sans"/>
                 <w:sz w:val="17"/>
               </w:rPr>
               <w:t>Control signals not carried by the ratchet</w:t>
@@ -2391,16 +2742,18 @@
         </w:tc>
         <w:tc>
           <w:tcPr>
-            <w:tcW w:type="dxa" w:w="2880"/>
+            <w:tcW w:type="dxa" w:w="3249"/>
           </w:tcPr>
           <w:p>
             <w:r>
               <w:rPr>
+                <w:rFonts w:ascii="Open Sans" w:hAnsi="Open Sans"/>
                 <w:sz w:val="17"/>
               </w:rPr>
             </w:r>
             <w:r>
               <w:rPr>
+                <w:rFonts w:ascii="Open Sans" w:hAnsi="Open Sans"/>
                 <w:b/>
                 <w:sz w:val="17"/>
               </w:rPr>
@@ -2408,6 +2761,7 @@
             </w:r>
             <w:r>
               <w:rPr>
+                <w:rFonts w:ascii="Open Sans" w:hAnsi="Open Sans"/>
                 <w:sz w:val="17"/>
               </w:rPr>
               <w:t>, tied to F1</w:t>
@@ -2418,16 +2772,20 @@
       <w:tr>
         <w:tc>
           <w:tcPr>
-            <w:tcW w:type="dxa" w:w="2880"/>
+            <w:tcW w:type="dxa" w:w="3249"/>
           </w:tcPr>
           <w:p>
             <w:r>
               <w:rPr>
+                <w:rFonts w:ascii="DejaVu Sans Mono" w:hAnsi="DejaVu Sans Mono"/>
+                <w:color w:val="307098"/>
                 <w:sz w:val="17"/>
               </w:rPr>
             </w:r>
             <w:r>
               <w:rPr>
+                <w:rFonts w:ascii="DejaVu Sans Mono" w:hAnsi="DejaVu Sans Mono"/>
+                <w:color w:val="307098"/>
                 <w:sz w:val="17"/>
               </w:rPr>
               <w:t>I4</w:t>
@@ -2436,16 +2794,18 @@
         </w:tc>
         <w:tc>
           <w:tcPr>
-            <w:tcW w:type="dxa" w:w="2880"/>
+            <w:tcW w:type="dxa" w:w="3249"/>
           </w:tcPr>
           <w:p>
             <w:r>
               <w:rPr>
+                <w:rFonts w:ascii="Open Sans" w:hAnsi="Open Sans"/>
                 <w:sz w:val="17"/>
               </w:rPr>
             </w:r>
             <w:r>
               <w:rPr>
+                <w:rFonts w:ascii="Open Sans" w:hAnsi="Open Sans"/>
                 <w:sz w:val="17"/>
               </w:rPr>
               <w:t>Biometric unlock without a cryptographic object, bypassable on a rooted phone with hooking tools</w:t>
@@ -2454,16 +2814,18 @@
         </w:tc>
         <w:tc>
           <w:tcPr>
-            <w:tcW w:type="dxa" w:w="2880"/>
+            <w:tcW w:type="dxa" w:w="3249"/>
           </w:tcPr>
           <w:p>
             <w:r>
               <w:rPr>
+                <w:rFonts w:ascii="Open Sans" w:hAnsi="Open Sans"/>
                 <w:sz w:val="17"/>
               </w:rPr>
             </w:r>
             <w:r>
               <w:rPr>
+                <w:rFonts w:ascii="Open Sans" w:hAnsi="Open Sans"/>
                 <w:sz w:val="17"/>
               </w:rPr>
               <w:t>Known limit</w:t>
@@ -2479,8 +2841,10 @@
       </w:r>
       <w:r>
         <w:rPr>
-          <w:rFonts w:ascii="Consolas" w:hAnsi="Consolas"/>
-          <w:sz w:val="18"/>
+          <w:rFonts w:ascii="DejaVu Sans Mono" w:hAnsi="DejaVu Sans Mono"/>
+          <w:color w:val="0F2A3A"/>
+          <w:sz w:val="17"/>
+          <w:shd w:val="clear" w:color="auto" w:fill="F2F6F9"/>
         </w:rPr>
         <w:t>TorManager</w:t>
       </w:r>
@@ -2489,13 +2853,98 @@
       </w:r>
     </w:p>
     <w:sectPr>
+      <w:headerReference w:type="default" r:id="rId9"/>
+      <w:footerReference w:type="default" r:id="rId10"/>
       <w:pgSz w:w="12240" w:h="15840"/>
-      <w:pgMar w:top="1440" w:right="1800" w:bottom="1440" w:left="1800" w:header="720" w:footer="720" w:gutter="0"/>
+      <w:pgMar w:top="1440" w:right="1247" w:bottom="1440" w:left="1247" w:header="720" w:footer="720" w:gutter="0"/>
       <w:cols w:space="720"/>
       <w:docGrid w:linePitch="360"/>
     </w:sectPr>
   </w:body>
 </w:document>
+</file>
+
+<file path=word/footer1.xml><?xml version="1.0" encoding="utf-8"?>
+<w:ftr xmlns:m="http://schemas.openxmlformats.org/officeDocument/2006/math" xmlns:mc="http://schemas.openxmlformats.org/markup-compatibility/2006" xmlns:mo="http://schemas.microsoft.com/office/mac/office/2008/main" xmlns:mv="urn:schemas-microsoft-com:mac:vml" xmlns:o="urn:schemas-microsoft-com:office:office" xmlns:r="http://schemas.openxmlformats.org/officeDocument/2006/relationships" xmlns:v="urn:schemas-microsoft-com:vml" xmlns:w10="urn:schemas-microsoft-com:office:word" xmlns:w14="http://schemas.microsoft.com/office/word/2010/wordml" xmlns:w="http://schemas.openxmlformats.org/wordprocessingml/2006/main" xmlns:wne="http://schemas.microsoft.com/office/word/2006/wordml" xmlns:wp14="http://schemas.microsoft.com/office/word/2010/wordprocessingDrawing" xmlns:wp="http://schemas.openxmlformats.org/drawingml/2006/wordprocessingDrawing" xmlns:wpc="http://schemas.microsoft.com/office/word/2010/wordprocessingCanvas" xmlns:wpg="http://schemas.microsoft.com/office/word/2010/wordprocessingGroup" xmlns:wpi="http://schemas.microsoft.com/office/word/2010/wordprocessingInk" xmlns:wps="http://schemas.microsoft.com/office/word/2010/wordprocessingShape" mc:Ignorable="w14 wp14">
+  <w:p>
+    <w:pPr>
+      <w:pStyle w:val="Footer"/>
+    </w:pPr>
+    <w:r>
+      <w:rPr>
+        <w:rFonts w:ascii="Open Sans" w:hAnsi="Open Sans"/>
+        <w:color w:val="4A5A66"/>
+        <w:sz w:val="16"/>
+      </w:rPr>
+      <w:t>NexonAI Consulting SRL, Alba Iulia  ·  pilot phase, not independently audited</w:t>
+    </w:r>
+  </w:p>
+</w:ftr>
+</file>
+
+<file path=word/header1.xml><?xml version="1.0" encoding="utf-8"?>
+<w:hdr xmlns:m="http://schemas.openxmlformats.org/officeDocument/2006/math" xmlns:mc="http://schemas.openxmlformats.org/markup-compatibility/2006" xmlns:mo="http://schemas.microsoft.com/office/mac/office/2008/main" xmlns:mv="urn:schemas-microsoft-com:mac:vml" xmlns:o="urn:schemas-microsoft-com:office:office" xmlns:r="http://schemas.openxmlformats.org/officeDocument/2006/relationships" xmlns:v="urn:schemas-microsoft-com:vml" xmlns:w10="urn:schemas-microsoft-com:office:word" xmlns:w14="http://schemas.microsoft.com/office/word/2010/wordml" xmlns:w="http://schemas.openxmlformats.org/wordprocessingml/2006/main" xmlns:wne="http://schemas.microsoft.com/office/word/2006/wordml" xmlns:wp14="http://schemas.microsoft.com/office/word/2010/wordprocessingDrawing" xmlns:wp="http://schemas.openxmlformats.org/drawingml/2006/wordprocessingDrawing" xmlns:wpc="http://schemas.microsoft.com/office/word/2010/wordprocessingCanvas" xmlns:wpg="http://schemas.microsoft.com/office/word/2010/wordprocessingGroup" xmlns:wpi="http://schemas.microsoft.com/office/word/2010/wordprocessingInk" xmlns:wps="http://schemas.microsoft.com/office/word/2010/wordprocessingShape" mc:Ignorable="w14 wp14">
+  <w:p>
+    <w:pPr>
+      <w:pStyle w:val="Header"/>
+      <w:pBdr>
+        <w:bottom w:val="single" w:sz="6" w:space="4" w:color="D9E4EA"/>
+      </w:pBdr>
+    </w:pPr>
+    <w:r>
+      <w:drawing>
+        <wp:inline xmlns:a="http://schemas.openxmlformats.org/drawingml/2006/main" xmlns:pic="http://schemas.openxmlformats.org/drawingml/2006/picture">
+          <wp:extent cx="1026367" cy="396000"/>
+          <wp:docPr id="1" name="Picture 1"/>
+          <wp:cNvGraphicFramePr>
+            <a:graphicFrameLocks noChangeAspect="1"/>
+          </wp:cNvGraphicFramePr>
+          <a:graphic>
+            <a:graphicData uri="http://schemas.openxmlformats.org/drawingml/2006/picture">
+              <pic:pic>
+                <pic:nvPicPr>
+                  <pic:cNvPr id="0" name="nexonai-logo.png"/>
+                  <pic:cNvPicPr/>
+                </pic:nvPicPr>
+                <pic:blipFill>
+                  <a:blip r:embed="rId1"/>
+                  <a:stretch>
+                    <a:fillRect/>
+                  </a:stretch>
+                </pic:blipFill>
+                <pic:spPr>
+                  <a:xfrm>
+                    <a:off x="0" y="0"/>
+                    <a:ext cx="1026367" cy="396000"/>
+                  </a:xfrm>
+                  <a:prstGeom prst="rect"/>
+                </pic:spPr>
+              </pic:pic>
+            </a:graphicData>
+          </a:graphic>
+        </wp:inline>
+      </w:drawing>
+    </w:r>
+    <w:r>
+      <w:rPr>
+        <w:rFonts w:ascii="Open Sans" w:hAnsi="Open Sans"/>
+        <w:b/>
+        <w:color w:val="0F2A3A"/>
+        <w:sz w:val="30"/>
+      </w:rPr>
+      <w:t xml:space="preserve">   |   unpruuf</w:t>
+    </w:r>
+    <w:r>
+      <w:rPr>
+        <w:rFonts w:ascii="Open Sans" w:hAnsi="Open Sans"/>
+        <w:b/>
+        <w:color w:val="307098"/>
+        <w:sz w:val="30"/>
+      </w:rPr>
+      <w:t>.</w:t>
+    </w:r>
+  </w:p>
+</w:hdr>
 </file>
 
 <file path=word/numbering.xml><?xml version="1.0" encoding="utf-8"?>
@@ -2862,8 +3311,9 @@
     <w:qFormat/>
     <w:rsid w:val="00FC693F"/>
     <w:rPr>
-      <w:rFonts w:ascii="Calibri" w:hAnsi="Calibri"/>
-      <w:sz w:val="21"/>
+      <w:rFonts w:ascii="Open Sans" w:hAnsi="Open Sans" w:cs="Open Sans" w:eastAsia="Open Sans"/>
+      <w:color w:val="0F2A3A"/>
+      <w:sz w:val="20"/>
     </w:rPr>
   </w:style>
   <w:style w:type="paragraph" w:styleId="Header">
@@ -2925,11 +3375,11 @@
       <w:outlineLvl w:val="0"/>
     </w:pPr>
     <w:rPr>
-      <w:rFonts w:asciiTheme="majorHAnsi" w:eastAsiaTheme="majorEastAsia" w:hAnsiTheme="majorHAnsi" w:cstheme="majorBidi"/>
+      <w:rFonts w:asciiTheme="majorHAnsi" w:eastAsiaTheme="majorEastAsia" w:hAnsiTheme="majorHAnsi" w:cstheme="majorBidi" w:ascii="Open Sans" w:hAnsi="Open Sans" w:cs="Open Sans" w:eastAsia="Open Sans"/>
       <w:b/>
       <w:bCs/>
-      <w:color w:val="365F91" w:themeColor="accent1" w:themeShade="BF"/>
-      <w:sz w:val="28"/>
+      <w:color w:val="0F2A3A"/>
+      <w:sz w:val="52"/>
       <w:szCs w:val="28"/>
     </w:rPr>
   </w:style>
@@ -2949,11 +3399,11 @@
       <w:outlineLvl w:val="1"/>
     </w:pPr>
     <w:rPr>
-      <w:rFonts w:asciiTheme="majorHAnsi" w:eastAsiaTheme="majorEastAsia" w:hAnsiTheme="majorHAnsi" w:cstheme="majorBidi"/>
+      <w:rFonts w:asciiTheme="majorHAnsi" w:eastAsiaTheme="majorEastAsia" w:hAnsiTheme="majorHAnsi" w:cstheme="majorBidi" w:ascii="Open Sans" w:hAnsi="Open Sans" w:cs="Open Sans" w:eastAsia="Open Sans"/>
       <w:b/>
       <w:bCs/>
-      <w:color w:val="4F81BD" w:themeColor="accent1"/>
-      <w:sz w:val="26"/>
+      <w:color w:val="0F2A3A"/>
+      <w:sz w:val="34"/>
       <w:szCs w:val="26"/>
     </w:rPr>
   </w:style>
@@ -2973,10 +3423,11 @@
       <w:outlineLvl w:val="2"/>
     </w:pPr>
     <w:rPr>
-      <w:rFonts w:asciiTheme="majorHAnsi" w:eastAsiaTheme="majorEastAsia" w:hAnsiTheme="majorHAnsi" w:cstheme="majorBidi"/>
+      <w:rFonts w:asciiTheme="majorHAnsi" w:eastAsiaTheme="majorEastAsia" w:hAnsiTheme="majorHAnsi" w:cstheme="majorBidi" w:ascii="Open Sans" w:hAnsi="Open Sans" w:cs="Open Sans" w:eastAsia="Open Sans"/>
       <w:b/>
       <w:bCs/>
-      <w:color w:val="4F81BD" w:themeColor="accent1"/>
+      <w:color w:val="0F2A3A"/>
+      <w:sz w:val="26"/>
     </w:rPr>
   </w:style>
   <w:style w:type="paragraph" w:styleId="Heading4">
@@ -3394,6 +3845,11 @@
       </w:numPr>
       <w:contextualSpacing/>
     </w:pPr>
+    <w:rPr>
+      <w:rFonts w:ascii="Open Sans" w:hAnsi="Open Sans" w:cs="Open Sans" w:eastAsia="Open Sans"/>
+      <w:color w:val="0F2A3A"/>
+      <w:sz w:val="20"/>
+    </w:rPr>
   </w:style>
   <w:style w:type="paragraph" w:styleId="ListBullet2">
     <w:name w:val="List Bullet 2"/>
@@ -3433,6 +3889,11 @@
       </w:numPr>
       <w:contextualSpacing/>
     </w:pPr>
+    <w:rPr>
+      <w:rFonts w:ascii="Open Sans" w:hAnsi="Open Sans" w:cs="Open Sans" w:eastAsia="Open Sans"/>
+      <w:color w:val="0F2A3A"/>
+      <w:sz w:val="20"/>
+    </w:rPr>
   </w:style>
   <w:style w:type="paragraph" w:styleId="ListNumber2">
     <w:name w:val="List Number 2"/>

</xml_diff>